<commit_message>
winning prompt and issue comments to test
</commit_message>
<xml_diff>
--- a/AISA_Bot/TODO.docx
+++ b/AISA_Bot/TODO.docx
@@ -56,7 +56,7 @@
         <w:t>Total Tasks</w:t>
       </w:r>
       <w:r>
-        <w:t>: 45</w:t>
+        <w:t>: 44</w:t>
       </w:r>
     </w:p>
     <w:p>
@@ -68,7 +68,7 @@
         <w:t>Progress</w:t>
       </w:r>
       <w:r>
-        <w:t>: 1/45 (2.2%)</w:t>
+        <w:t>: 1/44 (2.3%)</w:t>
       </w:r>
     </w:p>
     <w:p/>
@@ -300,7 +300,7 @@
         <w:pStyle w:val="Heading2"/>
       </w:pPr>
       <w:r>
-        <w:t>Phase 1: Setup &amp; Configuration (Tasks 1-9)</w:t>
+        <w:t>Phase 1: Setup &amp; Configuration (Tasks 1-8)</w:t>
       </w:r>
     </w:p>
     <w:p/>
@@ -531,7 +531,7 @@
         <w:t>Description</w:t>
       </w:r>
       <w:r>
-        <w:t>: Create config/contributors.json with predefined contributor list for POC phase</w:t>
+        <w:t>: Create config/contributors.json with predefined contributor list for POC phase (stored in repo, bot reads from here)</w:t>
       </w:r>
     </w:p>
     <w:p/>
@@ -540,7 +540,7 @@
         <w:pStyle w:val="Heading3"/>
       </w:pPr>
       <w:r>
-        <w:t>⏳ Task 8: Skills Taxonomy</w:t>
+        <w:t>⏳ Task 8: Data Directory Structure</w:t>
       </w:r>
     </w:p>
     <w:p>
@@ -564,7 +564,22 @@
         <w:t>Description</w:t>
       </w:r>
       <w:r>
-        <w:t>: Locate and examine HfLA_skills.csv file structure for skill taxonomy (convert to data/taxonomy/skills.json if needed)</w:t>
+        <w:t>: Ensure data/ directory structure exists in repo: data/taxonomy/ (committed), data/temp/ (gitignored), data/output/ (committed - bot writes CSV/JSON here)</w:t>
+      </w:r>
+    </w:p>
+    <w:p/>
+    <w:p>
+      <w:r>
+        <w:t>________________________________________________________________________________</w:t>
+      </w:r>
+    </w:p>
+    <w:p/>
+    <w:p>
+      <w:pPr>
+        <w:pStyle w:val="Heading2"/>
+      </w:pPr>
+      <w:r>
+        <w:t>Phase 2: Core Modules - GitHub Integration (Tasks 9-10)</w:t>
       </w:r>
     </w:p>
     <w:p/>
@@ -573,7 +588,7 @@
         <w:pStyle w:val="Heading3"/>
       </w:pPr>
       <w:r>
-        <w:t>⏳ Task 9: Data Directory Structure</w:t>
+        <w:t>⏳ Task 9: GitHub Fetcher Implementation</w:t>
       </w:r>
     </w:p>
     <w:p>
@@ -597,7 +612,40 @@
         <w:t>Description</w:t>
       </w:r>
       <w:r>
-        <w:t>: Create data/ directory structure: data/taxonomy/, data/temp/, data/output/ for CSV/JSON output files</w:t>
+        <w:t>: Implement src/github_fetcher.py: fetch_issue(), fetch_issue_comments(), fetch_issues_for_contributors(), check_existing_labels() using bot account credentials</w:t>
+      </w:r>
+    </w:p>
+    <w:p/>
+    <w:p>
+      <w:pPr>
+        <w:pStyle w:val="Heading3"/>
+      </w:pPr>
+      <w:r>
+        <w:t>⏳ Task 10: GitHub Fetcher Tests</w:t>
+      </w:r>
+    </w:p>
+    <w:p>
+      <w:r/>
+      <w:r>
+        <w:rPr>
+          <w:b/>
+        </w:rPr>
+        <w:t>Status</w:t>
+      </w:r>
+      <w:r>
+        <w:t>: PENDING</w:t>
+      </w:r>
+    </w:p>
+    <w:p>
+      <w:r/>
+      <w:r>
+        <w:rPr>
+          <w:b/>
+        </w:rPr>
+        <w:t>Description</w:t>
+      </w:r>
+      <w:r>
+        <w:t>: Create tests/test_github_fetcher.py with unit tests using mocked GitHub API responses and error handling</w:t>
       </w:r>
     </w:p>
     <w:p/>
@@ -612,7 +660,7 @@
         <w:pStyle w:val="Heading2"/>
       </w:pPr>
       <w:r>
-        <w:t>Phase 2: Core Modules - GitHub Integration (Tasks 10-11)</w:t>
+        <w:t>Phase 2: Core Modules - Prompt Building (Tasks 11-13)</w:t>
       </w:r>
     </w:p>
     <w:p/>
@@ -621,7 +669,7 @@
         <w:pStyle w:val="Heading3"/>
       </w:pPr>
       <w:r>
-        <w:t>⏳ Task 10: GitHub Fetcher Implementation</w:t>
+        <w:t>⏳ Task 11: Prompt Builder Implementation</w:t>
       </w:r>
     </w:p>
     <w:p>
@@ -645,7 +693,7 @@
         <w:t>Description</w:t>
       </w:r>
       <w:r>
-        <w:t>: Implement src/github_fetcher.py: fetch_issue(), fetch_issue_comments(), fetch_issues_for_contributors(), check_existing_labels()</w:t>
+        <w:t>: Implement src/prompt_builder.py: load_taxonomy() from repo, format_issue_context(), format_contributor_comments(), build_llm_prompt() for resume bullets and skill classification</w:t>
       </w:r>
     </w:p>
     <w:p/>
@@ -654,7 +702,7 @@
         <w:pStyle w:val="Heading3"/>
       </w:pPr>
       <w:r>
-        <w:t>⏳ Task 11: GitHub Fetcher Tests</w:t>
+        <w:t>⏳ Task 12: LLM Prompt Design</w:t>
       </w:r>
     </w:p>
     <w:p>
@@ -678,7 +726,40 @@
         <w:t>Description</w:t>
       </w:r>
       <w:r>
-        <w:t>: Create tests/test_github_fetcher.py with unit tests using mocked GitHub API responses and error handling</w:t>
+        <w:t>: Design LLM prompt format: STAR method instructions, 30-word limit, skill taxonomy inclusion, JSON output structure for bullets and labels</w:t>
+      </w:r>
+    </w:p>
+    <w:p/>
+    <w:p>
+      <w:pPr>
+        <w:pStyle w:val="Heading3"/>
+      </w:pPr>
+      <w:r>
+        <w:t>⏳ Task 13: Prompt Builder Tests</w:t>
+      </w:r>
+    </w:p>
+    <w:p>
+      <w:r/>
+      <w:r>
+        <w:rPr>
+          <w:b/>
+        </w:rPr>
+        <w:t>Status</w:t>
+      </w:r>
+      <w:r>
+        <w:t>: PENDING</w:t>
+      </w:r>
+    </w:p>
+    <w:p>
+      <w:r/>
+      <w:r>
+        <w:rPr>
+          <w:b/>
+        </w:rPr>
+        <w:t>Description</w:t>
+      </w:r>
+      <w:r>
+        <w:t>: Create tests/test_prompt_builder.py with unit tests for prompt formatting and taxonomy loading</w:t>
       </w:r>
     </w:p>
     <w:p/>
@@ -693,7 +774,7 @@
         <w:pStyle w:val="Heading2"/>
       </w:pPr>
       <w:r>
-        <w:t>Phase 2: Core Modules - Prompt Building (Tasks 12-14)</w:t>
+        <w:t>Phase 2: Core Modules - OpenAI Integration (Tasks 14-15)</w:t>
       </w:r>
     </w:p>
     <w:p/>
@@ -702,7 +783,7 @@
         <w:pStyle w:val="Heading3"/>
       </w:pPr>
       <w:r>
-        <w:t>⏳ Task 12: Prompt Builder Implementation</w:t>
+        <w:t>⏳ Task 14: OpenAI Client Implementation</w:t>
       </w:r>
     </w:p>
     <w:p>
@@ -726,7 +807,7 @@
         <w:t>Description</w:t>
       </w:r>
       <w:r>
-        <w:t>: Implement src/prompt_builder.py: load_taxonomy(), format_issue_context(), format_contributor_comments(), build_llm_prompt() for resume bullets and skill classification</w:t>
+        <w:t>: Implement src/openai_client.py: initialize_client() using GitHub Actions secrets, call_gpt4(), parse_response(), handle_rate_limiting() with exponential backoff for 500 RPM / 30K TPM limits</w:t>
       </w:r>
     </w:p>
     <w:p/>
@@ -735,7 +816,7 @@
         <w:pStyle w:val="Heading3"/>
       </w:pPr>
       <w:r>
-        <w:t>⏳ Task 13: LLM Prompt Design</w:t>
+        <w:t>⏳ Task 15: OpenAI Client Tests</w:t>
       </w:r>
     </w:p>
     <w:p>
@@ -759,7 +840,22 @@
         <w:t>Description</w:t>
       </w:r>
       <w:r>
-        <w:t>: Design LLM prompt format: STAR method instructions, 30-word limit, skill taxonomy inclusion, JSON output structure for bullets and labels</w:t>
+        <w:t>: Create tests/test_openai_client.py with unit tests using mocked OpenAI API responses</w:t>
+      </w:r>
+    </w:p>
+    <w:p/>
+    <w:p>
+      <w:r>
+        <w:t>________________________________________________________________________________</w:t>
+      </w:r>
+    </w:p>
+    <w:p/>
+    <w:p>
+      <w:pPr>
+        <w:pStyle w:val="Heading2"/>
+      </w:pPr>
+      <w:r>
+        <w:t>Phase 2: Core Modules - Label Handling (Tasks 16-19)</w:t>
       </w:r>
     </w:p>
     <w:p/>
@@ -768,7 +864,7 @@
         <w:pStyle w:val="Heading3"/>
       </w:pPr>
       <w:r>
-        <w:t>⏳ Task 14: Prompt Builder Tests</w:t>
+        <w:t>⏳ Task 16: Label Handler Implementation</w:t>
       </w:r>
     </w:p>
     <w:p>
@@ -792,7 +888,106 @@
         <w:t>Description</w:t>
       </w:r>
       <w:r>
-        <w:t>: Create tests/test_prompt_builder.py with unit tests for prompt formatting and taxonomy loading</w:t>
+        <w:t>: Implement src/label_handler.py: extract_labels_from_response(), validate_labels_against_taxonomy(), get_new_labels() for deduplication, supports both GitHub API labels and comment checklist modes</w:t>
+      </w:r>
+    </w:p>
+    <w:p/>
+    <w:p>
+      <w:pPr>
+        <w:pStyle w:val="Heading3"/>
+      </w:pPr>
+      <w:r>
+        <w:t>⏳ Task 17: Label Applier Implementation</w:t>
+      </w:r>
+    </w:p>
+    <w:p>
+      <w:r/>
+      <w:r>
+        <w:rPr>
+          <w:b/>
+        </w:rPr>
+        <w:t>Status</w:t>
+      </w:r>
+      <w:r>
+        <w:t>: PENDING</w:t>
+      </w:r>
+    </w:p>
+    <w:p>
+      <w:r/>
+      <w:r>
+        <w:rPr>
+          <w:b/>
+        </w:rPr>
+        <w:t>Description</w:t>
+      </w:r>
+      <w:r>
+        <w:t>: Implement src/label_applier.py: apply_labels_via_api() using bot account to apply skill labels directly to issues via GitHub API, check existing labels to avoid duplicates</w:t>
+      </w:r>
+    </w:p>
+    <w:p/>
+    <w:p>
+      <w:pPr>
+        <w:pStyle w:val="Heading3"/>
+      </w:pPr>
+      <w:r>
+        <w:t>⏳ Task 18: Label Handler Tests</w:t>
+      </w:r>
+    </w:p>
+    <w:p>
+      <w:r/>
+      <w:r>
+        <w:rPr>
+          <w:b/>
+        </w:rPr>
+        <w:t>Status</w:t>
+      </w:r>
+      <w:r>
+        <w:t>: PENDING</w:t>
+      </w:r>
+    </w:p>
+    <w:p>
+      <w:r/>
+      <w:r>
+        <w:rPr>
+          <w:b/>
+        </w:rPr>
+        <w:t>Description</w:t>
+      </w:r>
+      <w:r>
+        <w:t>: Create tests/test_label_handler.py with unit tests for label validation, deduplication, and taxonomy matching</w:t>
+      </w:r>
+    </w:p>
+    <w:p/>
+    <w:p>
+      <w:pPr>
+        <w:pStyle w:val="Heading3"/>
+      </w:pPr>
+      <w:r>
+        <w:t>⏳ Task 19: Label Applier Tests</w:t>
+      </w:r>
+    </w:p>
+    <w:p>
+      <w:r/>
+      <w:r>
+        <w:rPr>
+          <w:b/>
+        </w:rPr>
+        <w:t>Status</w:t>
+      </w:r>
+      <w:r>
+        <w:t>: PENDING</w:t>
+      </w:r>
+    </w:p>
+    <w:p>
+      <w:r/>
+      <w:r>
+        <w:rPr>
+          <w:b/>
+        </w:rPr>
+        <w:t>Description</w:t>
+      </w:r>
+      <w:r>
+        <w:t>: Create tests/test_label_applier.py with unit tests for GitHub API label application and error handling</w:t>
       </w:r>
     </w:p>
     <w:p/>
@@ -807,7 +1002,7 @@
         <w:pStyle w:val="Heading2"/>
       </w:pPr>
       <w:r>
-        <w:t>Phase 2: Core Modules - OpenAI Integration (Tasks 15-16)</w:t>
+        <w:t>Phase 2: Core Modules - Comment Posting (Tasks 20-23)</w:t>
       </w:r>
     </w:p>
     <w:p/>
@@ -816,7 +1011,7 @@
         <w:pStyle w:val="Heading3"/>
       </w:pPr>
       <w:r>
-        <w:t>⏳ Task 15: OpenAI Client Implementation</w:t>
+        <w:t>⏳ Task 20: Comment Poster Implementation</w:t>
       </w:r>
     </w:p>
     <w:p>
@@ -840,7 +1035,7 @@
         <w:t>Description</w:t>
       </w:r>
       <w:r>
-        <w:t>: Implement src/openai_client.py: initialize_client(), call_gpt4(), parse_response(), handle_rate_limiting() with exponential backoff for 500 RPM / 30K TPM limits</w:t>
+        <w:t>: Implement src/comment_poster.py: format_resume_comment(), format_skill_checklist_comment(), post_comment() using bot account with mode configuration for comment vs. API labels</w:t>
       </w:r>
     </w:p>
     <w:p/>
@@ -849,7 +1044,7 @@
         <w:pStyle w:val="Heading3"/>
       </w:pPr>
       <w:r>
-        <w:t>⏳ Task 16: OpenAI Client Tests</w:t>
+        <w:t>⏳ Task 21: Resume Bullet Template Design</w:t>
       </w:r>
     </w:p>
     <w:p>
@@ -873,7 +1068,73 @@
         <w:t>Description</w:t>
       </w:r>
       <w:r>
-        <w:t>: Create tests/test_openai_client.py with unit tests using mocked OpenAI API responses</w:t>
+        <w:t>: Design resume bullet comment template: opening message with automation link, bullets grouped by @username</w:t>
+      </w:r>
+    </w:p>
+    <w:p/>
+    <w:p>
+      <w:pPr>
+        <w:pStyle w:val="Heading3"/>
+      </w:pPr>
+      <w:r>
+        <w:t>⏳ Task 22: Skill Label Template Design</w:t>
+      </w:r>
+    </w:p>
+    <w:p>
+      <w:r/>
+      <w:r>
+        <w:rPr>
+          <w:b/>
+        </w:rPr>
+        <w:t>Status</w:t>
+      </w:r>
+      <w:r>
+        <w:t>: PENDING</w:t>
+      </w:r>
+    </w:p>
+    <w:p>
+      <w:r/>
+      <w:r>
+        <w:rPr>
+          <w:b/>
+        </w:rPr>
+        <w:t>Description</w:t>
+      </w:r>
+      <w:r>
+        <w:t>: Design skill label comment template: opening message, markdown checklist format with - [ ] Python, - [ ] Project Management (only used if SKILL_OUTPUT_MODE=comment)</w:t>
+      </w:r>
+    </w:p>
+    <w:p/>
+    <w:p>
+      <w:pPr>
+        <w:pStyle w:val="Heading3"/>
+      </w:pPr>
+      <w:r>
+        <w:t>⏳ Task 23: Comment Poster Tests</w:t>
+      </w:r>
+    </w:p>
+    <w:p>
+      <w:r/>
+      <w:r>
+        <w:rPr>
+          <w:b/>
+        </w:rPr>
+        <w:t>Status</w:t>
+      </w:r>
+      <w:r>
+        <w:t>: PENDING</w:t>
+      </w:r>
+    </w:p>
+    <w:p>
+      <w:r/>
+      <w:r>
+        <w:rPr>
+          <w:b/>
+        </w:rPr>
+        <w:t>Description</w:t>
+      </w:r>
+      <w:r>
+        <w:t>: Create tests/test_comment_poster.py with unit tests for both comment formats and posting logic</w:t>
       </w:r>
     </w:p>
     <w:p/>
@@ -888,7 +1149,7 @@
         <w:pStyle w:val="Heading2"/>
       </w:pPr>
       <w:r>
-        <w:t>Phase 2: Core Modules - Label Handling (Tasks 17-20)</w:t>
+        <w:t>Phase 2: Core Modules - Output &amp; Utils (Tasks 24-25)</w:t>
       </w:r>
     </w:p>
     <w:p/>
@@ -897,7 +1158,7 @@
         <w:pStyle w:val="Heading3"/>
       </w:pPr>
       <w:r>
-        <w:t>⏳ Task 17: Label Handler Implementation</w:t>
+        <w:t>⏳ Task 24: Output Writer Implementation</w:t>
       </w:r>
     </w:p>
     <w:p>
@@ -921,7 +1182,7 @@
         <w:t>Description</w:t>
       </w:r>
       <w:r>
-        <w:t>: Implement src/label_handler.py: extract_labels_from_response(), validate_labels_against_taxonomy(), get_new_labels() for deduplication, supports both GitHub API labels and comment checklist modes</w:t>
+        <w:t>: Implement src/output_writer.py: save CSV/JSON files to data/output/ in repo (bot commits these files back to repo), schema: contributor_id, contributor_name, issue_id, resume_bullets, skill_labels</w:t>
       </w:r>
     </w:p>
     <w:p/>
@@ -930,7 +1191,7 @@
         <w:pStyle w:val="Heading3"/>
       </w:pPr>
       <w:r>
-        <w:t>⏳ Task 18: Label Applier Implementation</w:t>
+        <w:t>⏳ Task 25: Utilities Implementation</w:t>
       </w:r>
     </w:p>
     <w:p>
@@ -954,7 +1215,22 @@
         <w:t>Description</w:t>
       </w:r>
       <w:r>
-        <w:t>: Implement src/label_applier.py: apply_labels_via_api() to apply skill labels directly to issues via GitHub API, check existing labels to avoid duplicates</w:t>
+        <w:t>: Implement src/utils.py: logging utilities, file I/O helpers, temp file management (comments, prompts, responses, logs per issue) - temp files gitignored, outputs committed</w:t>
+      </w:r>
+    </w:p>
+    <w:p/>
+    <w:p>
+      <w:r>
+        <w:t>________________________________________________________________________________</w:t>
+      </w:r>
+    </w:p>
+    <w:p/>
+    <w:p>
+      <w:pPr>
+        <w:pStyle w:val="Heading2"/>
+      </w:pPr>
+      <w:r>
+        <w:t>Phase 3: Pipeline Orchestration (Tasks 26-28)</w:t>
       </w:r>
     </w:p>
     <w:p/>
@@ -963,7 +1239,7 @@
         <w:pStyle w:val="Heading3"/>
       </w:pPr>
       <w:r>
-        <w:t>⏳ Task 19: Label Handler Tests</w:t>
+        <w:t>⏳ Task 26: Pipeline Implementation</w:t>
       </w:r>
     </w:p>
     <w:p>
@@ -987,7 +1263,7 @@
         <w:t>Description</w:t>
       </w:r>
       <w:r>
-        <w:t>: Create tests/test_label_handler.py with unit tests for label validation, deduplication, and taxonomy matching</w:t>
+        <w:t>: Implement src/pipeline.py: process_issue() with configurable skill output mode (api_labels, comment_checklist, or both), process_contributors(), log_pipeline_activity() with 1-minute timeout</w:t>
       </w:r>
     </w:p>
     <w:p/>
@@ -996,7 +1272,7 @@
         <w:pStyle w:val="Heading3"/>
       </w:pPr>
       <w:r>
-        <w:t>⏳ Task 20: Label Applier Tests</w:t>
+        <w:t>⏳ Task 27: Pipeline Tests</w:t>
       </w:r>
     </w:p>
     <w:p>
@@ -1020,7 +1296,40 @@
         <w:t>Description</w:t>
       </w:r>
       <w:r>
-        <w:t>: Create tests/test_label_applier.py with unit tests for GitHub API label application and error handling</w:t>
+        <w:t>: Create tests/test_pipeline.py with end-to-end integration tests for all three skill output modes</w:t>
+      </w:r>
+    </w:p>
+    <w:p/>
+    <w:p>
+      <w:pPr>
+        <w:pStyle w:val="Heading3"/>
+      </w:pPr>
+      <w:r>
+        <w:t>⏳ Task 28: CLI Entry Point</w:t>
+      </w:r>
+    </w:p>
+    <w:p>
+      <w:r/>
+      <w:r>
+        <w:rPr>
+          <w:b/>
+        </w:rPr>
+        <w:t>Status</w:t>
+      </w:r>
+      <w:r>
+        <w:t>: PENDING</w:t>
+      </w:r>
+    </w:p>
+    <w:p>
+      <w:r/>
+      <w:r>
+        <w:rPr>
+          <w:b/>
+        </w:rPr>
+        <w:t>Description</w:t>
+      </w:r>
+      <w:r>
+        <w:t>: Implement scripts/run_poc.py: CLI entry point for GitHub Actions runner with arguments (--issue, --contributors, --dry-run, --skill-mode [api|comment|both]), progress reporting</w:t>
       </w:r>
     </w:p>
     <w:p/>
@@ -1035,7 +1344,7 @@
         <w:pStyle w:val="Heading2"/>
       </w:pPr>
       <w:r>
-        <w:t>Phase 2: Core Modules - Comment Posting (Tasks 21-24)</w:t>
+        <w:t>Phase 4: Error Handling &amp; Logging (Tasks 29-32)</w:t>
       </w:r>
     </w:p>
     <w:p/>
@@ -1044,7 +1353,7 @@
         <w:pStyle w:val="Heading3"/>
       </w:pPr>
       <w:r>
-        <w:t>⏳ Task 21: Comment Poster Implementation</w:t>
+        <w:t>⏳ Task 29: Error Handling Implementation</w:t>
       </w:r>
     </w:p>
     <w:p>
@@ -1068,7 +1377,7 @@
         <w:t>Description</w:t>
       </w:r>
       <w:r>
-        <w:t>: Implement src/comment_poster.py: format_resume_comment(), format_skill_checklist_comment(), post_comment() with mode configuration for comment vs. API labels</w:t>
+        <w:t>: Implement error handling: post public error messages to issues with error code and user-friendly message, log full error details to structured error log (stored in repo)</w:t>
       </w:r>
     </w:p>
     <w:p/>
@@ -1077,7 +1386,7 @@
         <w:pStyle w:val="Heading3"/>
       </w:pPr>
       <w:r>
-        <w:t>⏳ Task 22: Resume Bullet Template Design</w:t>
+        <w:t>⏳ Task 30: Rate Limiting Implementation</w:t>
       </w:r>
     </w:p>
     <w:p>
@@ -1101,7 +1410,7 @@
         <w:t>Description</w:t>
       </w:r>
       <w:r>
-        <w:t>: Design resume bullet comment template: opening message with automation link, bullets grouped by @username</w:t>
+        <w:t>: Implement rate limiting with throttling logic: respect OpenAI Tier 1 limits (500 RPM, 30K TPM) and GitHub API limits, implement exponential backoff</w:t>
       </w:r>
     </w:p>
     <w:p/>
@@ -1110,7 +1419,7 @@
         <w:pStyle w:val="Heading3"/>
       </w:pPr>
       <w:r>
-        <w:t>⏳ Task 23: Skill Label Template Design</w:t>
+        <w:t>⏳ Task 31: Audit Logging System</w:t>
       </w:r>
     </w:p>
     <w:p>
@@ -1134,7 +1443,7 @@
         <w:t>Description</w:t>
       </w:r>
       <w:r>
-        <w:t>: Design skill label comment template: opening message, markdown checklist format with - [ ] Python, - [ ] Project Management (only used if SKILL_OUTPUT_MODE=comment)</w:t>
+        <w:t>: Create audit logging system: log all bot activity (user mentions, generated content, labels applied/posted, errors) to data/output/audit_log.json committed to repo</w:t>
       </w:r>
     </w:p>
     <w:p/>
@@ -1143,7 +1452,7 @@
         <w:pStyle w:val="Heading3"/>
       </w:pPr>
       <w:r>
-        <w:t>⏳ Task 24: Comment Poster Tests</w:t>
+        <w:t>⏳ Task 32: Temp File Generation</w:t>
       </w:r>
     </w:p>
     <w:p>
@@ -1167,7 +1476,7 @@
         <w:t>Description</w:t>
       </w:r>
       <w:r>
-        <w:t>: Create tests/test_comment_poster.py with unit tests for both comment formats and posting logic</w:t>
+        <w:t>: Implement temp file generation per issue: data/temp/issue_&lt;number&gt;_comments.json, issue_&lt;number&gt;_prompt.txt, issue_&lt;number&gt;_response.json, issue_&lt;number&gt;_log.json (gitignored, not committed)</w:t>
       </w:r>
     </w:p>
     <w:p/>
@@ -1182,7 +1491,7 @@
         <w:pStyle w:val="Heading2"/>
       </w:pPr>
       <w:r>
-        <w:t>Phase 2: Core Modules - Output &amp; Utils (Tasks 25-26)</w:t>
+        <w:t>Phase 5: Documentation (Tasks 33-34)</w:t>
       </w:r>
     </w:p>
     <w:p/>
@@ -1191,7 +1500,7 @@
         <w:pStyle w:val="Heading3"/>
       </w:pPr>
       <w:r>
-        <w:t>⏳ Task 25: Output Writer Implementation</w:t>
+        <w:t>⏳ Task 33: README Documentation</w:t>
       </w:r>
     </w:p>
     <w:p>
@@ -1215,7 +1524,7 @@
         <w:t>Description</w:t>
       </w:r>
       <w:r>
-        <w:t>: Implement src/output_writer.py: save CSV/JSON files to /data/output/ with schema: contributor_id, contributor_name, issue_id, resume_bullets, skill_labels</w:t>
+        <w:t>: Create comprehensive README.md: project overview, GitHub bot architecture, setup instructions for configuring two secrets (GITHUB_TOKEN and OPENAI_API_KEY stored in both 1Password and GitHub), environment configuration, skill output mode options, usage examples, credit to true-github-contributors</w:t>
       </w:r>
     </w:p>
     <w:p/>
@@ -1224,7 +1533,7 @@
         <w:pStyle w:val="Heading3"/>
       </w:pPr>
       <w:r>
-        <w:t>⏳ Task 26: Utilities Implementation</w:t>
+        <w:t>⏳ Task 34: Configuration Documentation</w:t>
       </w:r>
     </w:p>
     <w:p>
@@ -1248,7 +1557,7 @@
         <w:t>Description</w:t>
       </w:r>
       <w:r>
-        <w:t>: Implement src/utils.py: logging utilities, file I/O helpers, temp file management (comments, prompts, responses, logs per issue)</w:t>
+        <w:t>: Document configuration options: SKILL_OUTPUT_MODE (api_labels, comment_checklist, both), GitHub Actions secrets setup (two secrets: GITHUB_TOKEN and OPENAI_API_KEY), bot account permissions in README and settings.py</w:t>
       </w:r>
     </w:p>
     <w:p/>
@@ -1263,7 +1572,7 @@
         <w:pStyle w:val="Heading2"/>
       </w:pPr>
       <w:r>
-        <w:t>Phase 3: Pipeline Orchestration (Tasks 27-29)</w:t>
+        <w:t>Phase 6: Testing &amp; Validation (Tasks 35-38)</w:t>
       </w:r>
     </w:p>
     <w:p/>
@@ -1272,7 +1581,7 @@
         <w:pStyle w:val="Heading3"/>
       </w:pPr>
       <w:r>
-        <w:t>⏳ Task 27: Pipeline Implementation</w:t>
+        <w:t>⏳ Task 35: Unit Testing</w:t>
       </w:r>
     </w:p>
     <w:p>
@@ -1296,7 +1605,7 @@
         <w:t>Description</w:t>
       </w:r>
       <w:r>
-        <w:t>: Implement src/pipeline.py: process_issue() with configurable skill output mode (api_labels, comment_checklist, or both), process_contributors(), log_pipeline_activity() with 1-minute timeout</w:t>
+        <w:t>: Run unit tests for all three skill output modes and achieve &gt;80% code coverage</w:t>
       </w:r>
     </w:p>
     <w:p/>
@@ -1305,7 +1614,7 @@
         <w:pStyle w:val="Heading3"/>
       </w:pPr>
       <w:r>
-        <w:t>⏳ Task 28: Pipeline Tests</w:t>
+        <w:t>⏳ Task 36: Integration Testing</w:t>
       </w:r>
     </w:p>
     <w:p>
@@ -1329,7 +1638,7 @@
         <w:t>Description</w:t>
       </w:r>
       <w:r>
-        <w:t>: Create tests/test_pipeline.py with end-to-end integration tests for all three skill output modes</w:t>
+        <w:t>: Perform integration testing with real GitHub API and OpenAI API on test repository for all output modes</w:t>
       </w:r>
     </w:p>
     <w:p/>
@@ -1338,7 +1647,7 @@
         <w:pStyle w:val="Heading3"/>
       </w:pPr>
       <w:r>
-        <w:t>⏳ Task 29: CLI Entry Point</w:t>
+        <w:t>⏳ Task 37: Output Quality Validation</w:t>
       </w:r>
     </w:p>
     <w:p>
@@ -1362,7 +1671,40 @@
         <w:t>Description</w:t>
       </w:r>
       <w:r>
-        <w:t>: Implement scripts/run_poc.py: CLI entry point with arguments (--issue, --contributors, --dry-run, --skill-mode [api|comment|both]), progress reporting</w:t>
+        <w:t>: Validate LLM output quality: verify STAR format compliance, 30-word limit per bullet, skill labels match HfLA_skills.csv taxonomy</w:t>
+      </w:r>
+    </w:p>
+    <w:p/>
+    <w:p>
+      <w:pPr>
+        <w:pStyle w:val="Heading3"/>
+      </w:pPr>
+      <w:r>
+        <w:t>⏳ Task 38: Label Application Testing</w:t>
+      </w:r>
+    </w:p>
+    <w:p>
+      <w:r/>
+      <w:r>
+        <w:rPr>
+          <w:b/>
+        </w:rPr>
+        <w:t>Status</w:t>
+      </w:r>
+      <w:r>
+        <w:t>: PENDING</w:t>
+      </w:r>
+    </w:p>
+    <w:p>
+      <w:r/>
+      <w:r>
+        <w:rPr>
+          <w:b/>
+        </w:rPr>
+        <w:t>Description</w:t>
+      </w:r>
+      <w:r>
+        <w:t>: Test label application: verify GitHub API labels are applied correctly, existing labels are not duplicated, checklist comments format properly</w:t>
       </w:r>
     </w:p>
     <w:p/>
@@ -1377,7 +1719,7 @@
         <w:pStyle w:val="Heading2"/>
       </w:pPr>
       <w:r>
-        <w:t>Phase 4: Error Handling &amp; Logging (Tasks 30-33)</w:t>
+        <w:t>Phase 7: Performance &amp; Deployment (Tasks 39-41)</w:t>
       </w:r>
     </w:p>
     <w:p/>
@@ -1386,7 +1728,7 @@
         <w:pStyle w:val="Heading3"/>
       </w:pPr>
       <w:r>
-        <w:t>⏳ Task 30: Error Handling Implementation</w:t>
+        <w:t>⏳ Task 39: Performance Testing</w:t>
       </w:r>
     </w:p>
     <w:p>
@@ -1410,7 +1752,7 @@
         <w:t>Description</w:t>
       </w:r>
       <w:r>
-        <w:t>: Implement error handling: post public error messages to issues with error code and user-friendly message, log full error details to structured error log</w:t>
+        <w:t>: Performance testing: measure processing time per issue (must be ≤1 minute), identify bottlenecks, optimize if needed</w:t>
       </w:r>
     </w:p>
     <w:p/>
@@ -1419,7 +1761,7 @@
         <w:pStyle w:val="Heading3"/>
       </w:pPr>
       <w:r>
-        <w:t>⏳ Task 31: Rate Limiting Implementation</w:t>
+        <w:t>⏳ Task 40: GitHub Actions Workflow</w:t>
       </w:r>
     </w:p>
     <w:p>
@@ -1443,7 +1785,7 @@
         <w:t>Description</w:t>
       </w:r>
       <w:r>
-        <w:t>: Implement rate limiting with throttling logic: respect OpenAI Tier 1 limits (500 RPM, 30K TPM) and GitHub API limits, implement exponential backoff</w:t>
+        <w:t>: Create GitHub Actions workflow: .github/workflows/ai-skills-assessor.yml with cron schedule (daily trigger), job that runs scripts/run_poc.py, configurable skill output mode, secrets for GITHUB_TOKEN and OPENAI_API_KEY, auto-commit data/output/ files back to repo</w:t>
       </w:r>
     </w:p>
     <w:p/>
@@ -1452,7 +1794,7 @@
         <w:pStyle w:val="Heading3"/>
       </w:pPr>
       <w:r>
-        <w:t>⏳ Task 32: Audit Logging System</w:t>
+        <w:t>⏳ Task 41: Configure GitHub Actions Secrets</w:t>
       </w:r>
     </w:p>
     <w:p>
@@ -1476,7 +1818,22 @@
         <w:t>Description</w:t>
       </w:r>
       <w:r>
-        <w:t>: Create audit logging system: log all bot activity (user mentions, generated content, labels applied/posted, errors) to structured log files</w:t>
+        <w:t>: Configure GitHub Actions secrets in hackforla/ai-skills-assessor repo: add GITHUB_TOKEN (bot PAT) and OPENAI_API_KEY as repository secrets (master copies also stored in 1Password), verify bot account has collaborator permissions</w:t>
+      </w:r>
+    </w:p>
+    <w:p/>
+    <w:p>
+      <w:r>
+        <w:t>________________________________________________________________________________</w:t>
+      </w:r>
+    </w:p>
+    <w:p/>
+    <w:p>
+      <w:pPr>
+        <w:pStyle w:val="Heading2"/>
+      </w:pPr>
+      <w:r>
+        <w:t>Phase 8: POC Evaluation (Tasks 42-44)</w:t>
       </w:r>
     </w:p>
     <w:p/>
@@ -1485,7 +1842,7 @@
         <w:pStyle w:val="Heading3"/>
       </w:pPr>
       <w:r>
-        <w:t>⏳ Task 33: Temp File Generation</w:t>
+        <w:t>⏳ Task 42: Workflow Testing</w:t>
       </w:r>
     </w:p>
     <w:p>
@@ -1509,22 +1866,7 @@
         <w:t>Description</w:t>
       </w:r>
       <w:r>
-        <w:t>: Implement temp file generation per issue: issue_&lt;number&gt;_comments.json, issue_&lt;number&gt;_prompt.txt, issue_&lt;number&gt;_response.json, issue_&lt;number&gt;_log.json</w:t>
-      </w:r>
-    </w:p>
-    <w:p/>
-    <w:p>
-      <w:r>
-        <w:t>________________________________________________________________________________</w:t>
-      </w:r>
-    </w:p>
-    <w:p/>
-    <w:p>
-      <w:pPr>
-        <w:pStyle w:val="Heading2"/>
-      </w:pPr>
-      <w:r>
-        <w:t>Phase 5: Documentation (Tasks 34-35)</w:t>
+        <w:t>: Test workflow execution: verify cron trigger works, bot reads config/taxonomy from repo, processes issues, commits results to data/output/, secrets are properly configured, runs across all open issues in Hack for LA org</w:t>
       </w:r>
     </w:p>
     <w:p/>
@@ -1533,7 +1875,7 @@
         <w:pStyle w:val="Heading3"/>
       </w:pPr>
       <w:r>
-        <w:t>⏳ Task 34: README Documentation</w:t>
+        <w:t>⏳ Task 43: POC Evaluation Run</w:t>
       </w:r>
     </w:p>
     <w:p>
@@ -1557,7 +1899,7 @@
         <w:t>Description</w:t>
       </w:r>
       <w:r>
-        <w:t>: Create comprehensive README.md: project overview, GitHub bot architecture, setup instructions for configuring two secrets (GITHUB_TOKEN and OPENAI_API_KEY stored in both 1Password and GitHub), environment configuration, skill output mode options, usage examples, credit to true-github-contributors</w:t>
+        <w:t>: Run POC evaluation on 10-20 closed test issues from hackforla/website repo with different skill output modes, verify data/output/ files are committed to repo</w:t>
       </w:r>
     </w:p>
     <w:p/>
@@ -1566,7 +1908,7 @@
         <w:pStyle w:val="Heading3"/>
       </w:pPr>
       <w:r>
-        <w:t>⏳ Task 35: Configuration Documentation</w:t>
+        <w:t>⏳ Task 44: Evaluation Report</w:t>
       </w:r>
     </w:p>
     <w:p>
@@ -1590,382 +1932,7 @@
         <w:t>Description</w:t>
       </w:r>
       <w:r>
-        <w:t>: Document configuration options: SKILL_OUTPUT_MODE (api_labels, comment_checklist, both), GitHub Actions secrets setup (two secrets: GITHUB_TOKEN and OPENAI_API_KEY), bot account permissions in README and settings.py</w:t>
-      </w:r>
-    </w:p>
-    <w:p/>
-    <w:p>
-      <w:r>
-        <w:t>________________________________________________________________________________</w:t>
-      </w:r>
-    </w:p>
-    <w:p/>
-    <w:p>
-      <w:pPr>
-        <w:pStyle w:val="Heading2"/>
-      </w:pPr>
-      <w:r>
-        <w:t>Phase 6: Testing &amp; Validation (Tasks 36-39)</w:t>
-      </w:r>
-    </w:p>
-    <w:p/>
-    <w:p>
-      <w:pPr>
-        <w:pStyle w:val="Heading3"/>
-      </w:pPr>
-      <w:r>
-        <w:t>⏳ Task 36: Unit Testing</w:t>
-      </w:r>
-    </w:p>
-    <w:p>
-      <w:r/>
-      <w:r>
-        <w:rPr>
-          <w:b/>
-        </w:rPr>
-        <w:t>Status</w:t>
-      </w:r>
-      <w:r>
-        <w:t>: PENDING</w:t>
-      </w:r>
-    </w:p>
-    <w:p>
-      <w:r/>
-      <w:r>
-        <w:rPr>
-          <w:b/>
-        </w:rPr>
-        <w:t>Description</w:t>
-      </w:r>
-      <w:r>
-        <w:t>: Run unit tests for all three skill output modes and achieve &gt;80% code coverage</w:t>
-      </w:r>
-    </w:p>
-    <w:p/>
-    <w:p>
-      <w:pPr>
-        <w:pStyle w:val="Heading3"/>
-      </w:pPr>
-      <w:r>
-        <w:t>⏳ Task 37: Integration Testing</w:t>
-      </w:r>
-    </w:p>
-    <w:p>
-      <w:r/>
-      <w:r>
-        <w:rPr>
-          <w:b/>
-        </w:rPr>
-        <w:t>Status</w:t>
-      </w:r>
-      <w:r>
-        <w:t>: PENDING</w:t>
-      </w:r>
-    </w:p>
-    <w:p>
-      <w:r/>
-      <w:r>
-        <w:rPr>
-          <w:b/>
-        </w:rPr>
-        <w:t>Description</w:t>
-      </w:r>
-      <w:r>
-        <w:t>: Perform integration testing with real GitHub API and OpenAI API on test repository for all output modes</w:t>
-      </w:r>
-    </w:p>
-    <w:p/>
-    <w:p>
-      <w:pPr>
-        <w:pStyle w:val="Heading3"/>
-      </w:pPr>
-      <w:r>
-        <w:t>⏳ Task 38: Output Quality Validation</w:t>
-      </w:r>
-    </w:p>
-    <w:p>
-      <w:r/>
-      <w:r>
-        <w:rPr>
-          <w:b/>
-        </w:rPr>
-        <w:t>Status</w:t>
-      </w:r>
-      <w:r>
-        <w:t>: PENDING</w:t>
-      </w:r>
-    </w:p>
-    <w:p>
-      <w:r/>
-      <w:r>
-        <w:rPr>
-          <w:b/>
-        </w:rPr>
-        <w:t>Description</w:t>
-      </w:r>
-      <w:r>
-        <w:t>: Validate LLM output quality: verify STAR format compliance, 30-word limit per bullet, skill labels match HfLA_skills.csv taxonomy</w:t>
-      </w:r>
-    </w:p>
-    <w:p/>
-    <w:p>
-      <w:pPr>
-        <w:pStyle w:val="Heading3"/>
-      </w:pPr>
-      <w:r>
-        <w:t>⏳ Task 39: Label Application Testing</w:t>
-      </w:r>
-    </w:p>
-    <w:p>
-      <w:r/>
-      <w:r>
-        <w:rPr>
-          <w:b/>
-        </w:rPr>
-        <w:t>Status</w:t>
-      </w:r>
-      <w:r>
-        <w:t>: PENDING</w:t>
-      </w:r>
-    </w:p>
-    <w:p>
-      <w:r/>
-      <w:r>
-        <w:rPr>
-          <w:b/>
-        </w:rPr>
-        <w:t>Description</w:t>
-      </w:r>
-      <w:r>
-        <w:t>: Test label application: verify GitHub API labels are applied correctly, existing labels are not duplicated, checklist comments format properly</w:t>
-      </w:r>
-    </w:p>
-    <w:p/>
-    <w:p>
-      <w:r>
-        <w:t>________________________________________________________________________________</w:t>
-      </w:r>
-    </w:p>
-    <w:p/>
-    <w:p>
-      <w:pPr>
-        <w:pStyle w:val="Heading2"/>
-      </w:pPr>
-      <w:r>
-        <w:t>Phase 7: Performance &amp; Deployment (Tasks 40-42)</w:t>
-      </w:r>
-    </w:p>
-    <w:p/>
-    <w:p>
-      <w:pPr>
-        <w:pStyle w:val="Heading3"/>
-      </w:pPr>
-      <w:r>
-        <w:t>⏳ Task 40: Performance Testing</w:t>
-      </w:r>
-    </w:p>
-    <w:p>
-      <w:r/>
-      <w:r>
-        <w:rPr>
-          <w:b/>
-        </w:rPr>
-        <w:t>Status</w:t>
-      </w:r>
-      <w:r>
-        <w:t>: PENDING</w:t>
-      </w:r>
-    </w:p>
-    <w:p>
-      <w:r/>
-      <w:r>
-        <w:rPr>
-          <w:b/>
-        </w:rPr>
-        <w:t>Description</w:t>
-      </w:r>
-      <w:r>
-        <w:t>: Performance testing: measure processing time per issue (must be ≤1 minute), identify bottlenecks, optimize if needed</w:t>
-      </w:r>
-    </w:p>
-    <w:p/>
-    <w:p>
-      <w:pPr>
-        <w:pStyle w:val="Heading3"/>
-      </w:pPr>
-      <w:r>
-        <w:t>⏳ Task 41: GitHub Actions Workflow</w:t>
-      </w:r>
-    </w:p>
-    <w:p>
-      <w:r/>
-      <w:r>
-        <w:rPr>
-          <w:b/>
-        </w:rPr>
-        <w:t>Status</w:t>
-      </w:r>
-      <w:r>
-        <w:t>: PENDING</w:t>
-      </w:r>
-    </w:p>
-    <w:p>
-      <w:r/>
-      <w:r>
-        <w:rPr>
-          <w:b/>
-        </w:rPr>
-        <w:t>Description</w:t>
-      </w:r>
-      <w:r>
-        <w:t>: Create GitHub Actions workflow: .github/workflows/ai-skills-assessor.yml with cron schedule (daily trigger), job that runs scripts/run_poc.py, configurable skill output mode, secrets for GITHUB_TOKEN and OPENAI_API_KEY, auto-commit data/output/ files back to repo</w:t>
-      </w:r>
-    </w:p>
-    <w:p/>
-    <w:p>
-      <w:pPr>
-        <w:pStyle w:val="Heading3"/>
-      </w:pPr>
-      <w:r>
-        <w:t>⏳ Task 41b: Configure GitHub Actions Secrets</w:t>
-      </w:r>
-    </w:p>
-    <w:p>
-      <w:r/>
-      <w:r>
-        <w:rPr>
-          <w:b/>
-        </w:rPr>
-        <w:t>Status</w:t>
-      </w:r>
-      <w:r>
-        <w:t>: PENDING</w:t>
-      </w:r>
-    </w:p>
-    <w:p>
-      <w:r/>
-      <w:r>
-        <w:rPr>
-          <w:b/>
-        </w:rPr>
-        <w:t>Description</w:t>
-      </w:r>
-      <w:r>
-        <w:t>: Configure GitHub Actions secrets in hackforla/ai-skills-assessor repo: add GITHUB_TOKEN (bot PAT) and OPENAI_API_KEY as repository secrets (master copies also stored in 1Password), verify bot account has collaborator permissions</w:t>
-      </w:r>
-    </w:p>
-    <w:p/>
-    <w:p>
-      <w:pPr>
-        <w:pStyle w:val="Heading3"/>
-      </w:pPr>
-      <w:r>
-        <w:t>⏳ Task 42: Workflow Testing</w:t>
-      </w:r>
-    </w:p>
-    <w:p>
-      <w:r/>
-      <w:r>
-        <w:rPr>
-          <w:b/>
-        </w:rPr>
-        <w:t>Status</w:t>
-      </w:r>
-      <w:r>
-        <w:t>: PENDING</w:t>
-      </w:r>
-    </w:p>
-    <w:p>
-      <w:r/>
-      <w:r>
-        <w:rPr>
-          <w:b/>
-        </w:rPr>
-        <w:t>Description</w:t>
-      </w:r>
-      <w:r>
-        <w:t>: Test workflow execution: verify daily trigger works, secrets are properly configured, skill output mode configuration works, runs across all open issues in Hack for LA org</w:t>
-      </w:r>
-    </w:p>
-    <w:p/>
-    <w:p>
-      <w:r>
-        <w:t>________________________________________________________________________________</w:t>
-      </w:r>
-    </w:p>
-    <w:p/>
-    <w:p>
-      <w:pPr>
-        <w:pStyle w:val="Heading2"/>
-      </w:pPr>
-      <w:r>
-        <w:t>Phase 8: POC Evaluation (Tasks 43-44)</w:t>
-      </w:r>
-    </w:p>
-    <w:p/>
-    <w:p>
-      <w:pPr>
-        <w:pStyle w:val="Heading3"/>
-      </w:pPr>
-      <w:r>
-        <w:t>⏳ Task 43: POC Evaluation Run</w:t>
-      </w:r>
-    </w:p>
-    <w:p>
-      <w:r/>
-      <w:r>
-        <w:rPr>
-          <w:b/>
-        </w:rPr>
-        <w:t>Status</w:t>
-      </w:r>
-      <w:r>
-        <w:t>: PENDING</w:t>
-      </w:r>
-    </w:p>
-    <w:p>
-      <w:r/>
-      <w:r>
-        <w:rPr>
-          <w:b/>
-        </w:rPr>
-        <w:t>Description</w:t>
-      </w:r>
-      <w:r>
-        <w:t>: Run POC evaluation on 10-20 closed test issues from hackforla/website repo with different skill output modes</w:t>
-      </w:r>
-    </w:p>
-    <w:p/>
-    <w:p>
-      <w:pPr>
-        <w:pStyle w:val="Heading3"/>
-      </w:pPr>
-      <w:r>
-        <w:t>⏳ Task 44: Evaluation Report</w:t>
-      </w:r>
-    </w:p>
-    <w:p>
-      <w:r/>
-      <w:r>
-        <w:rPr>
-          <w:b/>
-        </w:rPr>
-        <w:t>Status</w:t>
-      </w:r>
-      <w:r>
-        <w:t>: PENDING</w:t>
-      </w:r>
-    </w:p>
-    <w:p>
-      <w:r/>
-      <w:r>
-        <w:rPr>
-          <w:b/>
-        </w:rPr>
-        <w:t>Description</w:t>
-      </w:r>
-      <w:r>
-        <w:t>: Generate evaluation report with metrics: processing time, output quality, error rates, API cost analysis, comparison of skill output modes</w:t>
+        <w:t>: Generate evaluation report with metrics: processing time, output quality, error rates, API cost analysis, comparison of skill output modes, commit report to repo</w:t>
       </w:r>
     </w:p>
     <w:p/>

</xml_diff>

<commit_message>
updated to do with current progress
</commit_message>
<xml_diff>
--- a/AISA_Bot/TODO.docx
+++ b/AISA_Bot/TODO.docx
@@ -65,10 +65,40 @@
         <w:rPr>
           <w:b/>
         </w:rPr>
+        <w:t>Completed</w:t>
+      </w:r>
+      <w:r>
+        <w:t xml:space="preserve">: 1 | </w:t>
+      </w:r>
+      <w:r>
+        <w:rPr>
+          <w:b/>
+        </w:rPr>
+        <w:t>Partially Completed</w:t>
+      </w:r>
+      <w:r>
+        <w:t xml:space="preserve">: 7 | </w:t>
+      </w:r>
+      <w:r>
+        <w:rPr>
+          <w:b/>
+        </w:rPr>
+        <w:t>Pending</w:t>
+      </w:r>
+      <w:r>
+        <w:t>: 36</w:t>
+      </w:r>
+    </w:p>
+    <w:p>
+      <w:r/>
+      <w:r>
+        <w:rPr>
+          <w:b/>
+        </w:rPr>
         <w:t>Progress</w:t>
       </w:r>
       <w:r>
-        <w:t>: 1/44 (2.3%)</w:t>
+        <w:t>: 8/44 (18.2%)</w:t>
       </w:r>
     </w:p>
     <w:p/>
@@ -330,6 +360,18 @@
         <w:rPr>
           <w:b/>
         </w:rPr>
+        <w:t>Programmer</w:t>
+      </w:r>
+      <w:r>
+        <w:t>: Claude Code (2025-10-20)</w:t>
+      </w:r>
+    </w:p>
+    <w:p>
+      <w:r/>
+      <w:r>
+        <w:rPr>
+          <w:b/>
+        </w:rPr>
         <w:t>Description</w:t>
       </w:r>
       <w:r>
@@ -375,7 +417,7 @@
         <w:pStyle w:val="Heading3"/>
       </w:pPr>
       <w:r>
-        <w:t>⏳ Task 3: .gitignore</w:t>
+        <w:t>🔄 Task 3: .gitignore</w:t>
       </w:r>
     </w:p>
     <w:p>
@@ -387,6 +429,144 @@
         <w:t>Status</w:t>
       </w:r>
       <w:r>
+        <w:t>: PARTIALLY COMPLETED</w:t>
+      </w:r>
+    </w:p>
+    <w:p>
+      <w:r/>
+      <w:r>
+        <w:rPr>
+          <w:b/>
+        </w:rPr>
+        <w:t>Programmer</w:t>
+      </w:r>
+      <w:r>
+        <w:t>: JasonUranta</w:t>
+      </w:r>
+    </w:p>
+    <w:p>
+      <w:r/>
+      <w:r>
+        <w:rPr>
+          <w:b/>
+        </w:rPr>
+        <w:t>Existing Work</w:t>
+      </w:r>
+      <w:r>
+        <w:t>: Root-level .gitignore exists with `.env`, `node_modules/`, `package-lock.json`, `coverage/`</w:t>
+      </w:r>
+    </w:p>
+    <w:p>
+      <w:r/>
+      <w:r>
+        <w:rPr>
+          <w:b/>
+        </w:rPr>
+        <w:t>Remaining Work</w:t>
+      </w:r>
+      <w:r>
+        <w:t>: Need to add `__pycache__`, `*.pyc`, ensure data/output/ and data/taxonomy/ are NOT ignored, move or create AISA_Bot-specific .gitignore</w:t>
+      </w:r>
+    </w:p>
+    <w:p>
+      <w:r/>
+      <w:r>
+        <w:rPr>
+          <w:b/>
+        </w:rPr>
+        <w:t>Location</w:t>
+      </w:r>
+      <w:r>
+        <w:t>: `C:\Users\Putna\OneDrive - Johns Hopkins\Documents\Hack For LA\AI Skills Assessor Project\.gitignore`</w:t>
+      </w:r>
+    </w:p>
+    <w:p/>
+    <w:p>
+      <w:pPr>
+        <w:pStyle w:val="Heading3"/>
+      </w:pPr>
+      <w:r>
+        <w:t>🔄 Task 4: Requirements File</w:t>
+      </w:r>
+    </w:p>
+    <w:p>
+      <w:r/>
+      <w:r>
+        <w:rPr>
+          <w:b/>
+        </w:rPr>
+        <w:t>Status</w:t>
+      </w:r>
+      <w:r>
+        <w:t>: PARTIALLY COMPLETED</w:t>
+      </w:r>
+    </w:p>
+    <w:p>
+      <w:r/>
+      <w:r>
+        <w:rPr>
+          <w:b/>
+        </w:rPr>
+        <w:t>Programmers</w:t>
+      </w:r>
+      <w:r>
+        <w:t>: chinaexpert1, ExperimentsInHonesty</w:t>
+      </w:r>
+    </w:p>
+    <w:p>
+      <w:r/>
+      <w:r>
+        <w:rPr>
+          <w:b/>
+        </w:rPr>
+        <w:t>Existing Work</w:t>
+      </w:r>
+      <w:r>
+        <w:t>: Root-level requirements.txt exists with `requests&gt;=2.32,&lt;3.0`</w:t>
+      </w:r>
+    </w:p>
+    <w:p>
+      <w:r/>
+      <w:r>
+        <w:rPr>
+          <w:b/>
+        </w:rPr>
+        <w:t>Remaining Work</w:t>
+      </w:r>
+      <w:r>
+        <w:t>: Need to add PyGithub, python-dotenv, openai, pytest, openpyxl/pandas dependencies</w:t>
+      </w:r>
+    </w:p>
+    <w:p>
+      <w:r/>
+      <w:r>
+        <w:rPr>
+          <w:b/>
+        </w:rPr>
+        <w:t>Location</w:t>
+      </w:r>
+      <w:r>
+        <w:t>: `C:\Users\Putna\OneDrive - Johns Hopkins\Documents\Hack For LA\AI Skills Assessor Project\requirements.txt`</w:t>
+      </w:r>
+    </w:p>
+    <w:p/>
+    <w:p>
+      <w:pPr>
+        <w:pStyle w:val="Heading3"/>
+      </w:pPr>
+      <w:r>
+        <w:t>⏳ Task 5: Environment Template</w:t>
+      </w:r>
+    </w:p>
+    <w:p>
+      <w:r/>
+      <w:r>
+        <w:rPr>
+          <w:b/>
+        </w:rPr>
+        <w:t>Status</w:t>
+      </w:r>
+      <w:r>
         <w:t>: PENDING</w:t>
       </w:r>
     </w:p>
@@ -399,7 +579,7 @@
         <w:t>Description</w:t>
       </w:r>
       <w:r>
-        <w:t>: Create .gitignore file excluding .env, __pycache__, *.pyc (but INCLUDE data/output/ and data/taxonomy/ for GitHub repo storage)</w:t>
+        <w:t>: Create .env.example template with GITHUB_TOKEN and OPENAI_API_KEY placeholders (actual secrets stored in both 1Password AND GitHub secrets)</w:t>
       </w:r>
     </w:p>
     <w:p/>
@@ -408,7 +588,7 @@
         <w:pStyle w:val="Heading3"/>
       </w:pPr>
       <w:r>
-        <w:t>⏳ Task 4: Requirements File</w:t>
+        <w:t>⏳ Task 6: Settings Configuration</w:t>
       </w:r>
     </w:p>
     <w:p>
@@ -432,7 +612,7 @@
         <w:t>Description</w:t>
       </w:r>
       <w:r>
-        <w:t>: Create requirements.txt with dependencies: PyGithub, python-dotenv, openai, pytest, openpyxl/pandas for CSV parsing</w:t>
+        <w:t>: Create config/settings.py for constants: GitHub org/repo names, API endpoints, rate limits (500 RPM, 30K TPM), 1-minute timeout per issue, file paths (all paths relative for GitHub Actions runner), SKILL_OUTPUT_MODE configuration</w:t>
       </w:r>
     </w:p>
     <w:p/>
@@ -441,7 +621,7 @@
         <w:pStyle w:val="Heading3"/>
       </w:pPr>
       <w:r>
-        <w:t>⏳ Task 5: Environment Template</w:t>
+        <w:t>⏳ Task 7: Contributors List</w:t>
       </w:r>
     </w:p>
     <w:p>
@@ -465,7 +645,7 @@
         <w:t>Description</w:t>
       </w:r>
       <w:r>
-        <w:t>: Create .env.example template with GITHUB_TOKEN and OPENAI_API_KEY placeholders (actual secrets stored in both 1Password AND GitHub secrets)</w:t>
+        <w:t>: Create config/contributors.json with predefined contributor list for POC phase (stored in repo, bot reads from here)</w:t>
       </w:r>
     </w:p>
     <w:p/>
@@ -474,7 +654,7 @@
         <w:pStyle w:val="Heading3"/>
       </w:pPr>
       <w:r>
-        <w:t>⏳ Task 6: Settings Configuration</w:t>
+        <w:t>🔄 Task 8: Data Directory Structure</w:t>
       </w:r>
     </w:p>
     <w:p>
@@ -486,6 +666,377 @@
         <w:t>Status</w:t>
       </w:r>
       <w:r>
+        <w:t>: PARTIALLY COMPLETED</w:t>
+      </w:r>
+    </w:p>
+    <w:p>
+      <w:r/>
+      <w:r>
+        <w:rPr>
+          <w:b/>
+        </w:rPr>
+        <w:t>Programmers</w:t>
+      </w:r>
+      <w:r>
+        <w:t>: JasonUranta (scripts/data), Sandy3w (issue_contributor_fetcher)</w:t>
+      </w:r>
+    </w:p>
+    <w:p>
+      <w:r/>
+      <w:r>
+        <w:rPr>
+          <w:b/>
+        </w:rPr>
+        <w:t>Existing Work</w:t>
+      </w:r>
+      <w:r>
+        <w:t>:</w:t>
+      </w:r>
+    </w:p>
+    <w:p>
+      <w:pPr>
+        <w:pStyle w:val="ListBullet"/>
+      </w:pPr>
+      <w:r>
+        <w:t>`data/` directory exists with `issue_comments.json` (246KB)</w:t>
+      </w:r>
+    </w:p>
+    <w:p>
+      <w:pPr>
+        <w:pStyle w:val="ListBullet"/>
+      </w:pPr>
+      <w:r>
+        <w:t>`API_repo_labels/data/` exists with `excel_labels_data.xlsx` (3.5MB) and `labels_data.json` (48KB - taxonomy)</w:t>
+      </w:r>
+    </w:p>
+    <w:p>
+      <w:pPr>
+        <w:pStyle w:val="ListBullet"/>
+      </w:pPr>
+      <w:r>
+        <w:t>`config/` directory exists with `target_repos_status.json`</w:t>
+      </w:r>
+    </w:p>
+    <w:p>
+      <w:r/>
+      <w:r>
+        <w:rPr>
+          <w:b/>
+        </w:rPr>
+        <w:t>Remaining Work</w:t>
+      </w:r>
+      <w:r>
+        <w:t>:</w:t>
+      </w:r>
+    </w:p>
+    <w:p>
+      <w:pPr>
+        <w:pStyle w:val="ListBullet"/>
+      </w:pPr>
+      <w:r>
+        <w:t>Create `AISA_Bot/data/taxonomy/` and move/copy skills taxonomy</w:t>
+      </w:r>
+    </w:p>
+    <w:p>
+      <w:pPr>
+        <w:pStyle w:val="ListBullet"/>
+      </w:pPr>
+      <w:r>
+        <w:t>Create `AISA_Bot/data/temp/` (gitignored)</w:t>
+      </w:r>
+    </w:p>
+    <w:p>
+      <w:pPr>
+        <w:pStyle w:val="ListBullet"/>
+      </w:pPr>
+      <w:r>
+        <w:t>Create `AISA_Bot/data/output/` (committed)</w:t>
+      </w:r>
+    </w:p>
+    <w:p/>
+    <w:p>
+      <w:r>
+        <w:t>________________________________________________________________________________</w:t>
+      </w:r>
+    </w:p>
+    <w:p/>
+    <w:p>
+      <w:pPr>
+        <w:pStyle w:val="Heading2"/>
+      </w:pPr>
+      <w:r>
+        <w:t>Phase 2: Core Modules - GitHub Integration (Tasks 9-10)</w:t>
+      </w:r>
+    </w:p>
+    <w:p/>
+    <w:p>
+      <w:pPr>
+        <w:pStyle w:val="Heading3"/>
+      </w:pPr>
+      <w:r>
+        <w:t>🔄 Task 9: GitHub Fetcher Implementation</w:t>
+      </w:r>
+    </w:p>
+    <w:p>
+      <w:r/>
+      <w:r>
+        <w:rPr>
+          <w:b/>
+        </w:rPr>
+        <w:t>Status</w:t>
+      </w:r>
+      <w:r>
+        <w:t>: PARTIALLY COMPLETED</w:t>
+      </w:r>
+    </w:p>
+    <w:p>
+      <w:r/>
+      <w:r>
+        <w:rPr>
+          <w:b/>
+        </w:rPr>
+        <w:t>Programmers</w:t>
+      </w:r>
+      <w:r>
+        <w:t>: JasonUranta (scripts/fetch-issue-comments.py), Sandy3w (issue_contributor_fetcher)</w:t>
+      </w:r>
+    </w:p>
+    <w:p>
+      <w:r/>
+      <w:r>
+        <w:rPr>
+          <w:b/>
+        </w:rPr>
+        <w:t>Existing Work</w:t>
+      </w:r>
+      <w:r>
+        <w:t>:</w:t>
+      </w:r>
+    </w:p>
+    <w:p>
+      <w:r>
+        <w:t xml:space="preserve">- </w:t>
+      </w:r>
+      <w:r>
+        <w:rPr>
+          <w:b/>
+        </w:rPr>
+        <w:t>scripts/fetch-issue-comments.py</w:t>
+      </w:r>
+      <w:r>
+        <w:t xml:space="preserve"> (672 lines) by JasonUranta: Comprehensive issue comment fetcher with:</w:t>
+      </w:r>
+    </w:p>
+    <w:p>
+      <w:pPr>
+        <w:pStyle w:val="ListBullet"/>
+      </w:pPr>
+      <w:r>
+        <w:t>Incremental sync using watermarks</w:t>
+      </w:r>
+    </w:p>
+    <w:p>
+      <w:pPr>
+        <w:pStyle w:val="ListBullet"/>
+      </w:pPr>
+      <w:r>
+        <w:t>Per-endpoint watermarks (issues vs reviews)</w:t>
+      </w:r>
+    </w:p>
+    <w:p>
+      <w:pPr>
+        <w:pStyle w:val="ListBullet"/>
+      </w:pPr>
+      <w:r>
+        <w:t>Full-resync support</w:t>
+      </w:r>
+    </w:p>
+    <w:p>
+      <w:pPr>
+        <w:pStyle w:val="ListBullet"/>
+      </w:pPr>
+      <w:r>
+        <w:t>304/ETag support for conditional requests</w:t>
+      </w:r>
+    </w:p>
+    <w:p>
+      <w:pPr>
+        <w:pStyle w:val="ListBullet"/>
+      </w:pPr>
+      <w:r>
+        <w:t>Robust pagination with retry logic</w:t>
+      </w:r>
+    </w:p>
+    <w:p>
+      <w:pPr>
+        <w:pStyle w:val="ListBullet"/>
+      </w:pPr>
+      <w:r>
+        <w:t>Rate-limit handling with exponential backoff (handles 403, 429, Retry-After, X-RateLimit-Reset)</w:t>
+      </w:r>
+    </w:p>
+    <w:p>
+      <w:pPr>
+        <w:pStyle w:val="ListBullet"/>
+      </w:pPr>
+      <w:r>
+        <w:t>Reaction data collection</w:t>
+      </w:r>
+    </w:p>
+    <w:p>
+      <w:pPr>
+        <w:pStyle w:val="ListBullet"/>
+      </w:pPr>
+      <w:r>
+        <w:t>Normalized timestamps</w:t>
+      </w:r>
+    </w:p>
+    <w:p>
+      <w:pPr>
+        <w:pStyle w:val="ListBullet"/>
+      </w:pPr>
+      <w:r>
+        <w:t>Atomic JSON writes</w:t>
+      </w:r>
+    </w:p>
+    <w:p>
+      <w:pPr>
+        <w:pStyle w:val="ListBullet"/>
+      </w:pPr>
+      <w:r>
+        <w:t>Outputs to `data/issue_comments.json`</w:t>
+      </w:r>
+    </w:p>
+    <w:p>
+      <w:r>
+        <w:t xml:space="preserve">- </w:t>
+      </w:r>
+      <w:r>
+        <w:rPr>
+          <w:b/>
+        </w:rPr>
+        <w:t>issue_contributor_fetcher/org_fetcher/org_fetcher.py</w:t>
+      </w:r>
+      <w:r>
+        <w:t xml:space="preserve"> (226 lines) by Sandy3w: Org-level contribution fetching</w:t>
+      </w:r>
+    </w:p>
+    <w:p>
+      <w:pPr>
+        <w:pStyle w:val="ListBullet"/>
+      </w:pPr>
+      <w:r>
+        <w:t>Fetches all repos for an organization</w:t>
+      </w:r>
+    </w:p>
+    <w:p>
+      <w:pPr>
+        <w:pStyle w:val="ListBullet"/>
+      </w:pPr>
+      <w:r>
+        <w:t>Fetches contributions (issues/PRs) for specified users across repos</w:t>
+      </w:r>
+    </w:p>
+    <w:p>
+      <w:pPr>
+        <w:pStyle w:val="ListBullet"/>
+      </w:pPr>
+      <w:r>
+        <w:t>HTTPAdapter with retry logic</w:t>
+      </w:r>
+    </w:p>
+    <w:p>
+      <w:pPr>
+        <w:pStyle w:val="ListBullet"/>
+      </w:pPr>
+      <w:r>
+        <w:t>Pagination handling</w:t>
+      </w:r>
+    </w:p>
+    <w:p>
+      <w:pPr>
+        <w:pStyle w:val="ListBullet"/>
+      </w:pPr>
+      <w:r>
+        <w:t>Outputs to CSV</w:t>
+      </w:r>
+    </w:p>
+    <w:p>
+      <w:r>
+        <w:t xml:space="preserve">- </w:t>
+      </w:r>
+      <w:r>
+        <w:rPr>
+          <w:b/>
+        </w:rPr>
+        <w:t>issue_contributor_fetcher/repo_fetcher/repo_fetcher.py</w:t>
+      </w:r>
+      <w:r>
+        <w:t xml:space="preserve"> (172 lines) by Sandy3w: Repo-level contribution fetching</w:t>
+      </w:r>
+    </w:p>
+    <w:p>
+      <w:pPr>
+        <w:pStyle w:val="ListBullet"/>
+      </w:pPr>
+      <w:r>
+        <w:t>GitHub Search API with "involves:" query</w:t>
+      </w:r>
+    </w:p>
+    <w:p>
+      <w:pPr>
+        <w:pStyle w:val="ListBullet"/>
+      </w:pPr>
+      <w:r>
+        <w:t>Session management with retries</w:t>
+      </w:r>
+    </w:p>
+    <w:p>
+      <w:r/>
+      <w:r>
+        <w:rPr>
+          <w:b/>
+        </w:rPr>
+        <w:t>Remaining Work</w:t>
+      </w:r>
+      <w:r>
+        <w:t>:</w:t>
+      </w:r>
+    </w:p>
+    <w:p>
+      <w:pPr>
+        <w:pStyle w:val="ListBullet"/>
+      </w:pPr>
+      <w:r>
+        <w:t>Consolidate into `src/github_fetcher.py` with functions: `fetch_issue()`, `fetch_issue_comments()`, `fetch_issues_for_contributors()`, `check_existing_labels()`</w:t>
+      </w:r>
+    </w:p>
+    <w:p>
+      <w:pPr>
+        <w:pStyle w:val="ListBullet"/>
+      </w:pPr>
+      <w:r>
+        <w:t>Adapt for AISA_Bot requirements and bot account credentials</w:t>
+      </w:r>
+    </w:p>
+    <w:p/>
+    <w:p>
+      <w:pPr>
+        <w:pStyle w:val="Heading3"/>
+      </w:pPr>
+      <w:r>
+        <w:t>⏳ Task 10: GitHub Fetcher Tests</w:t>
+      </w:r>
+    </w:p>
+    <w:p>
+      <w:r/>
+      <w:r>
+        <w:rPr>
+          <w:b/>
+        </w:rPr>
+        <w:t>Status</w:t>
+      </w:r>
+      <w:r>
         <w:t>: PENDING</w:t>
       </w:r>
     </w:p>
@@ -498,16 +1049,31 @@
         <w:t>Description</w:t>
       </w:r>
       <w:r>
-        <w:t>: Create config/settings.py for constants: GitHub org/repo names, API endpoints, rate limits (500 RPM, 30K TPM), 1-minute timeout per issue, file paths (all paths relative for GitHub Actions runner), SKILL_OUTPUT_MODE configuration</w:t>
+        <w:t>: Create tests/test_github_fetcher.py with unit tests using mocked GitHub API responses and error handling</w:t>
       </w:r>
     </w:p>
     <w:p/>
     <w:p>
+      <w:r>
+        <w:t>________________________________________________________________________________</w:t>
+      </w:r>
+    </w:p>
+    <w:p/>
+    <w:p>
+      <w:pPr>
+        <w:pStyle w:val="Heading2"/>
+      </w:pPr>
+      <w:r>
+        <w:t>Phase 2: Core Modules - Prompt Building (Tasks 11-13)</w:t>
+      </w:r>
+    </w:p>
+    <w:p/>
+    <w:p>
       <w:pPr>
         <w:pStyle w:val="Heading3"/>
       </w:pPr>
       <w:r>
-        <w:t>⏳ Task 7: Contributors List</w:t>
+        <w:t>🔄 Task 11: Prompt Builder Implementation</w:t>
       </w:r>
     </w:p>
     <w:p>
@@ -519,7 +1085,162 @@
         <w:t>Status</w:t>
       </w:r>
       <w:r>
-        <w:t>: PENDING</w:t>
+        <w:t>: PARTIALLY COMPLETED</w:t>
+      </w:r>
+    </w:p>
+    <w:p>
+      <w:r/>
+      <w:r>
+        <w:rPr>
+          <w:b/>
+        </w:rPr>
+        <w:t>Programmer</w:t>
+      </w:r>
+      <w:r>
+        <w:t>: Unknown</w:t>
+      </w:r>
+    </w:p>
+    <w:p>
+      <w:r/>
+      <w:r>
+        <w:rPr>
+          <w:b/>
+        </w:rPr>
+        <w:t>Existing Work</w:t>
+      </w:r>
+      <w:r>
+        <w:t>:</w:t>
+      </w:r>
+    </w:p>
+    <w:p>
+      <w:r>
+        <w:t xml:space="preserve">- </w:t>
+      </w:r>
+      <w:r>
+        <w:rPr>
+          <w:b/>
+        </w:rPr>
+        <w:t>API_repo_labels/scripts/excel_to_json.py</w:t>
+      </w:r>
+      <w:r>
+        <w:t>: Implements taxonomy loading and conversion</w:t>
+      </w:r>
+    </w:p>
+    <w:p>
+      <w:pPr>
+        <w:pStyle w:val="ListBullet"/>
+      </w:pPr>
+      <w:r>
+        <w:t>Converts `excel_labels_data.xlsx` to `labels_data.json`</w:t>
+      </w:r>
+    </w:p>
+    <w:p>
+      <w:pPr>
+        <w:pStyle w:val="ListBullet"/>
+      </w:pPr>
+      <w:r>
+        <w:t>Filters "sure" labels only</w:t>
+      </w:r>
+    </w:p>
+    <w:p>
+      <w:pPr>
+        <w:pStyle w:val="ListBullet"/>
+      </w:pPr>
+      <w:r>
+        <w:t>Creates keywords from concepts for label assignment</w:t>
+      </w:r>
+    </w:p>
+    <w:p>
+      <w:pPr>
+        <w:pStyle w:val="ListBullet"/>
+      </w:pPr>
+      <w:r>
+        <w:t>Maps label series to colors</w:t>
+      </w:r>
+    </w:p>
+    <w:p>
+      <w:pPr>
+        <w:pStyle w:val="ListBullet"/>
+      </w:pPr>
+      <w:r>
+        <w:t>This implements the `load_taxonomy()` functionality</w:t>
+      </w:r>
+    </w:p>
+    <w:p>
+      <w:r/>
+      <w:r>
+        <w:rPr>
+          <w:b/>
+        </w:rPr>
+        <w:t>Remaining Work</w:t>
+      </w:r>
+      <w:r>
+        <w:t>:</w:t>
+      </w:r>
+    </w:p>
+    <w:p>
+      <w:pPr>
+        <w:pStyle w:val="ListBullet"/>
+      </w:pPr>
+      <w:r>
+        <w:t>Implement `format_issue_context()` function</w:t>
+      </w:r>
+    </w:p>
+    <w:p>
+      <w:pPr>
+        <w:pStyle w:val="ListBullet"/>
+      </w:pPr>
+      <w:r>
+        <w:t>Implement `format_contributor_comments()` function</w:t>
+      </w:r>
+    </w:p>
+    <w:p>
+      <w:pPr>
+        <w:pStyle w:val="ListBullet"/>
+      </w:pPr>
+      <w:r>
+        <w:t>Implement `build_llm_prompt()` function for resume bullets and skill classification</w:t>
+      </w:r>
+    </w:p>
+    <w:p>
+      <w:pPr>
+        <w:pStyle w:val="ListBullet"/>
+      </w:pPr>
+      <w:r>
+        <w:t>Consolidate into `src/prompt_builder.py`</w:t>
+      </w:r>
+    </w:p>
+    <w:p/>
+    <w:p>
+      <w:pPr>
+        <w:pStyle w:val="Heading3"/>
+      </w:pPr>
+      <w:r>
+        <w:t>⏳ Task 12: LLM Prompt Design</w:t>
+      </w:r>
+    </w:p>
+    <w:p>
+      <w:r/>
+      <w:r>
+        <w:rPr>
+          <w:b/>
+        </w:rPr>
+        <w:t>Status</w:t>
+      </w:r>
+      <w:r>
+        <w:t>: PENDING (Research done by chinaexpert1, pending implementation from Sandy3w)</w:t>
+      </w:r>
+    </w:p>
+    <w:p>
+      <w:r/>
+      <w:r>
+        <w:rPr>
+          <w:b/>
+        </w:rPr>
+        <w:t>Programmers</w:t>
+      </w:r>
+      <w:r>
+        <w:t>: chinaexpert1 (research), Sandy3w (pending implementation)</w:t>
       </w:r>
     </w:p>
     <w:p>
@@ -531,7 +1252,19 @@
         <w:t>Description</w:t>
       </w:r>
       <w:r>
-        <w:t>: Create config/contributors.json with predefined contributor list for POC phase (stored in repo, bot reads from here)</w:t>
+        <w:t>: Design LLM prompt format: STAR method instructions, 30-word limit, skill taxonomy inclusion, JSON output structure for bullets and labels</w:t>
+      </w:r>
+    </w:p>
+    <w:p>
+      <w:r/>
+      <w:r>
+        <w:rPr>
+          <w:b/>
+        </w:rPr>
+        <w:t>Note</w:t>
+      </w:r>
+      <w:r>
+        <w:t>: Prompt research has been completed by chinaexpert1; awaiting implementation from Sandy3w</w:t>
       </w:r>
     </w:p>
     <w:p/>
@@ -540,7 +1273,7 @@
         <w:pStyle w:val="Heading3"/>
       </w:pPr>
       <w:r>
-        <w:t>⏳ Task 8: Data Directory Structure</w:t>
+        <w:t>⏳ Task 13: Prompt Builder Tests</w:t>
       </w:r>
     </w:p>
     <w:p>
@@ -564,7 +1297,7 @@
         <w:t>Description</w:t>
       </w:r>
       <w:r>
-        <w:t>: Ensure data/ directory structure exists in repo: data/taxonomy/ (committed), data/temp/ (gitignored), data/output/ (committed - bot writes CSV/JSON here)</w:t>
+        <w:t>: Create tests/test_prompt_builder.py with unit tests for prompt formatting and taxonomy loading</w:t>
       </w:r>
     </w:p>
     <w:p/>
@@ -579,7 +1312,7 @@
         <w:pStyle w:val="Heading2"/>
       </w:pPr>
       <w:r>
-        <w:t>Phase 2: Core Modules - GitHub Integration (Tasks 9-10)</w:t>
+        <w:t>Phase 2: Core Modules - OpenAI Integration (Tasks 14-15)</w:t>
       </w:r>
     </w:p>
     <w:p/>
@@ -588,7 +1321,7 @@
         <w:pStyle w:val="Heading3"/>
       </w:pPr>
       <w:r>
-        <w:t>⏳ Task 9: GitHub Fetcher Implementation</w:t>
+        <w:t>⏳ Task 14: OpenAI Client Implementation</w:t>
       </w:r>
     </w:p>
     <w:p>
@@ -612,7 +1345,7 @@
         <w:t>Description</w:t>
       </w:r>
       <w:r>
-        <w:t>: Implement src/github_fetcher.py: fetch_issue(), fetch_issue_comments(), fetch_issues_for_contributors(), check_existing_labels() using bot account credentials</w:t>
+        <w:t>: Implement src/openai_client.py: initialize_client() using GitHub Actions secrets, call_gpt4(), parse_response(), handle_rate_limiting() with exponential backoff for 500 RPM / 30K TPM limits</w:t>
       </w:r>
     </w:p>
     <w:p/>
@@ -621,7 +1354,7 @@
         <w:pStyle w:val="Heading3"/>
       </w:pPr>
       <w:r>
-        <w:t>⏳ Task 10: GitHub Fetcher Tests</w:t>
+        <w:t>⏳ Task 15: OpenAI Client Tests</w:t>
       </w:r>
     </w:p>
     <w:p>
@@ -645,7 +1378,7 @@
         <w:t>Description</w:t>
       </w:r>
       <w:r>
-        <w:t>: Create tests/test_github_fetcher.py with unit tests using mocked GitHub API responses and error handling</w:t>
+        <w:t>: Create tests/test_openai_client.py with unit tests using mocked OpenAI API responses</w:t>
       </w:r>
     </w:p>
     <w:p/>
@@ -660,7 +1393,7 @@
         <w:pStyle w:val="Heading2"/>
       </w:pPr>
       <w:r>
-        <w:t>Phase 2: Core Modules - Prompt Building (Tasks 11-13)</w:t>
+        <w:t>Phase 2: Core Modules - Label Handling (Tasks 16-19)</w:t>
       </w:r>
     </w:p>
     <w:p/>
@@ -669,7 +1402,7 @@
         <w:pStyle w:val="Heading3"/>
       </w:pPr>
       <w:r>
-        <w:t>⏳ Task 11: Prompt Builder Implementation</w:t>
+        <w:t>⏳ Task 16: Label Handler Implementation</w:t>
       </w:r>
     </w:p>
     <w:p>
@@ -693,7 +1426,7 @@
         <w:t>Description</w:t>
       </w:r>
       <w:r>
-        <w:t>: Implement src/prompt_builder.py: load_taxonomy() from repo, format_issue_context(), format_contributor_comments(), build_llm_prompt() for resume bullets and skill classification</w:t>
+        <w:t>: Implement src/label_handler.py: extract_labels_from_response(), validate_labels_against_taxonomy(), get_new_labels() for deduplication, supports both GitHub API labels and comment checklist modes</w:t>
       </w:r>
     </w:p>
     <w:p/>
@@ -702,7 +1435,7 @@
         <w:pStyle w:val="Heading3"/>
       </w:pPr>
       <w:r>
-        <w:t>⏳ Task 12: LLM Prompt Design</w:t>
+        <w:t>🔄 Task 17: Label Applier Implementation</w:t>
       </w:r>
     </w:p>
     <w:p>
@@ -714,6 +1447,173 @@
         <w:t>Status</w:t>
       </w:r>
       <w:r>
+        <w:t>: PARTIALLY COMPLETED</w:t>
+      </w:r>
+    </w:p>
+    <w:p>
+      <w:r/>
+      <w:r>
+        <w:rPr>
+          <w:b/>
+        </w:rPr>
+        <w:t>Programmer</w:t>
+      </w:r>
+      <w:r>
+        <w:t>: Unknown</w:t>
+      </w:r>
+    </w:p>
+    <w:p>
+      <w:r/>
+      <w:r>
+        <w:rPr>
+          <w:b/>
+        </w:rPr>
+        <w:t>Existing Work</w:t>
+      </w:r>
+      <w:r>
+        <w:t>:</w:t>
+      </w:r>
+    </w:p>
+    <w:p>
+      <w:r>
+        <w:t xml:space="preserve">- </w:t>
+      </w:r>
+      <w:r>
+        <w:rPr>
+          <w:b/>
+        </w:rPr>
+        <w:t>API_repo_labels/scripts/repo_labeler.py</w:t>
+      </w:r>
+      <w:r>
+        <w:t xml:space="preserve"> (173 lines): Implements comprehensive label creation/application</w:t>
+      </w:r>
+    </w:p>
+    <w:p>
+      <w:pPr>
+        <w:pStyle w:val="ListBullet"/>
+      </w:pPr>
+      <w:r>
+        <w:t>Checks repo access permissions</w:t>
+      </w:r>
+    </w:p>
+    <w:p>
+      <w:pPr>
+        <w:pStyle w:val="ListBullet"/>
+      </w:pPr>
+      <w:r>
+        <w:t>Loads labels from `labels_data.json`</w:t>
+      </w:r>
+    </w:p>
+    <w:p>
+      <w:pPr>
+        <w:pStyle w:val="ListBullet"/>
+      </w:pPr>
+      <w:r>
+        <w:t>Creates labels via GitHub API with deduplication</w:t>
+      </w:r>
+    </w:p>
+    <w:p>
+      <w:pPr>
+        <w:pStyle w:val="ListBullet"/>
+      </w:pPr>
+      <w:r>
+        <w:t>Sophisticated rate limiting:</w:t>
+      </w:r>
+    </w:p>
+    <w:p>
+      <w:pPr>
+        <w:pStyle w:val="ListBullet"/>
+      </w:pPr>
+      <w:r>
+        <w:t>Primary rate limit handling (X-RateLimit-Remaining)</w:t>
+      </w:r>
+    </w:p>
+    <w:p>
+      <w:pPr>
+        <w:pStyle w:val="ListBullet"/>
+      </w:pPr>
+      <w:r>
+        <w:t>Secondary rate limit detection ("secondary rate limit" and "abuse detection" in response)</w:t>
+      </w:r>
+    </w:p>
+    <w:p>
+      <w:pPr>
+        <w:pStyle w:val="ListBullet"/>
+      </w:pPr>
+      <w:r>
+        <w:t>Exponential backoff (starts at 5s, max 60s)</w:t>
+      </w:r>
+    </w:p>
+    <w:p>
+      <w:pPr>
+        <w:pStyle w:val="ListBullet"/>
+      </w:pPr>
+      <w:r>
+        <w:t>Batch rest every 10 successful creations</w:t>
+      </w:r>
+    </w:p>
+    <w:p>
+      <w:pPr>
+        <w:pStyle w:val="ListBullet"/>
+      </w:pPr>
+      <w:r>
+        <w:t>This substantially implements the `apply_labels_via_api()` functionality</w:t>
+      </w:r>
+    </w:p>
+    <w:p>
+      <w:r/>
+      <w:r>
+        <w:rPr>
+          <w:b/>
+        </w:rPr>
+        <w:t>Remaining Work</w:t>
+      </w:r>
+      <w:r>
+        <w:t>:</w:t>
+      </w:r>
+    </w:p>
+    <w:p>
+      <w:pPr>
+        <w:pStyle w:val="ListBullet"/>
+      </w:pPr>
+      <w:r>
+        <w:t>Adapt for applying labels to issues (currently creates repo labels)</w:t>
+      </w:r>
+    </w:p>
+    <w:p>
+      <w:pPr>
+        <w:pStyle w:val="ListBullet"/>
+      </w:pPr>
+      <w:r>
+        <w:t>Add `check_existing_labels()` to avoid duplicates on issues</w:t>
+      </w:r>
+    </w:p>
+    <w:p>
+      <w:pPr>
+        <w:pStyle w:val="ListBullet"/>
+      </w:pPr>
+      <w:r>
+        <w:t>Consolidate into `src/label_applier.py`</w:t>
+      </w:r>
+    </w:p>
+    <w:p/>
+    <w:p>
+      <w:pPr>
+        <w:pStyle w:val="Heading3"/>
+      </w:pPr>
+      <w:r>
+        <w:t>⏳ Task 18: Label Handler Tests</w:t>
+      </w:r>
+    </w:p>
+    <w:p>
+      <w:r/>
+      <w:r>
+        <w:rPr>
+          <w:b/>
+        </w:rPr>
+        <w:t>Status</w:t>
+      </w:r>
+      <w:r>
         <w:t>: PENDING</w:t>
       </w:r>
     </w:p>
@@ -726,7 +1626,7 @@
         <w:t>Description</w:t>
       </w:r>
       <w:r>
-        <w:t>: Design LLM prompt format: STAR method instructions, 30-word limit, skill taxonomy inclusion, JSON output structure for bullets and labels</w:t>
+        <w:t>: Create tests/test_label_handler.py with unit tests for label validation, deduplication, and taxonomy matching</w:t>
       </w:r>
     </w:p>
     <w:p/>
@@ -735,7 +1635,7 @@
         <w:pStyle w:val="Heading3"/>
       </w:pPr>
       <w:r>
-        <w:t>⏳ Task 13: Prompt Builder Tests</w:t>
+        <w:t>⏳ Task 19: Label Applier Tests</w:t>
       </w:r>
     </w:p>
     <w:p>
@@ -759,7 +1659,7 @@
         <w:t>Description</w:t>
       </w:r>
       <w:r>
-        <w:t>: Create tests/test_prompt_builder.py with unit tests for prompt formatting and taxonomy loading</w:t>
+        <w:t>: Create tests/test_label_applier.py with unit tests for GitHub API label application and error handling</w:t>
       </w:r>
     </w:p>
     <w:p/>
@@ -774,7 +1674,7 @@
         <w:pStyle w:val="Heading2"/>
       </w:pPr>
       <w:r>
-        <w:t>Phase 2: Core Modules - OpenAI Integration (Tasks 14-15)</w:t>
+        <w:t>Phase 2: Core Modules - Comment Posting (Tasks 20-23)</w:t>
       </w:r>
     </w:p>
     <w:p/>
@@ -783,7 +1683,7 @@
         <w:pStyle w:val="Heading3"/>
       </w:pPr>
       <w:r>
-        <w:t>⏳ Task 14: OpenAI Client Implementation</w:t>
+        <w:t>⏳ Task 20: Comment Poster Implementation</w:t>
       </w:r>
     </w:p>
     <w:p>
@@ -807,7 +1707,7 @@
         <w:t>Description</w:t>
       </w:r>
       <w:r>
-        <w:t>: Implement src/openai_client.py: initialize_client() using GitHub Actions secrets, call_gpt4(), parse_response(), handle_rate_limiting() with exponential backoff for 500 RPM / 30K TPM limits</w:t>
+        <w:t>: Implement src/comment_poster.py: format_resume_comment(), format_skill_checklist_comment(), post_comment() using bot account with mode configuration for comment vs. API labels</w:t>
       </w:r>
     </w:p>
     <w:p/>
@@ -816,7 +1716,7 @@
         <w:pStyle w:val="Heading3"/>
       </w:pPr>
       <w:r>
-        <w:t>⏳ Task 15: OpenAI Client Tests</w:t>
+        <w:t>⏳ Task 21: Resume Bullet Template Design</w:t>
       </w:r>
     </w:p>
     <w:p>
@@ -840,31 +1740,16 @@
         <w:t>Description</w:t>
       </w:r>
       <w:r>
-        <w:t>: Create tests/test_openai_client.py with unit tests using mocked OpenAI API responses</w:t>
+        <w:t>: Design resume bullet comment template: opening message with automation link, bullets grouped by @username</w:t>
       </w:r>
     </w:p>
     <w:p/>
     <w:p>
-      <w:r>
-        <w:t>________________________________________________________________________________</w:t>
-      </w:r>
-    </w:p>
-    <w:p/>
-    <w:p>
-      <w:pPr>
-        <w:pStyle w:val="Heading2"/>
-      </w:pPr>
-      <w:r>
-        <w:t>Phase 2: Core Modules - Label Handling (Tasks 16-19)</w:t>
-      </w:r>
-    </w:p>
-    <w:p/>
-    <w:p>
       <w:pPr>
         <w:pStyle w:val="Heading3"/>
       </w:pPr>
       <w:r>
-        <w:t>⏳ Task 16: Label Handler Implementation</w:t>
+        <w:t>⏳ Task 22: Skill Label Template Design</w:t>
       </w:r>
     </w:p>
     <w:p>
@@ -888,7 +1773,7 @@
         <w:t>Description</w:t>
       </w:r>
       <w:r>
-        <w:t>: Implement src/label_handler.py: extract_labels_from_response(), validate_labels_against_taxonomy(), get_new_labels() for deduplication, supports both GitHub API labels and comment checklist modes</w:t>
+        <w:t>: Design skill label comment template: opening message, markdown checklist format with - [ ] Python, - [ ] Project Management (only used if SKILL_OUTPUT_MODE=comment)</w:t>
       </w:r>
     </w:p>
     <w:p/>
@@ -897,7 +1782,7 @@
         <w:pStyle w:val="Heading3"/>
       </w:pPr>
       <w:r>
-        <w:t>⏳ Task 17: Label Applier Implementation</w:t>
+        <w:t>⏳ Task 23: Comment Poster Tests</w:t>
       </w:r>
     </w:p>
     <w:p>
@@ -921,16 +1806,31 @@
         <w:t>Description</w:t>
       </w:r>
       <w:r>
-        <w:t>: Implement src/label_applier.py: apply_labels_via_api() using bot account to apply skill labels directly to issues via GitHub API, check existing labels to avoid duplicates</w:t>
+        <w:t>: Create tests/test_comment_poster.py with unit tests for both comment formats and posting logic</w:t>
       </w:r>
     </w:p>
     <w:p/>
     <w:p>
+      <w:r>
+        <w:t>________________________________________________________________________________</w:t>
+      </w:r>
+    </w:p>
+    <w:p/>
+    <w:p>
+      <w:pPr>
+        <w:pStyle w:val="Heading2"/>
+      </w:pPr>
+      <w:r>
+        <w:t>Phase 2: Core Modules - Output &amp; Utils (Tasks 24-25)</w:t>
+      </w:r>
+    </w:p>
+    <w:p/>
+    <w:p>
       <w:pPr>
         <w:pStyle w:val="Heading3"/>
       </w:pPr>
       <w:r>
-        <w:t>⏳ Task 18: Label Handler Tests</w:t>
+        <w:t>⏳ Task 24: Output Writer Implementation</w:t>
       </w:r>
     </w:p>
     <w:p>
@@ -954,7 +1854,7 @@
         <w:t>Description</w:t>
       </w:r>
       <w:r>
-        <w:t>: Create tests/test_label_handler.py with unit tests for label validation, deduplication, and taxonomy matching</w:t>
+        <w:t>: Implement src/output_writer.py: save CSV/JSON files to data/output/ in repo (bot commits these files back to repo), schema: contributor_id, contributor_name, issue_id, resume_bullets, skill_labels</w:t>
       </w:r>
     </w:p>
     <w:p/>
@@ -963,7 +1863,7 @@
         <w:pStyle w:val="Heading3"/>
       </w:pPr>
       <w:r>
-        <w:t>⏳ Task 19: Label Applier Tests</w:t>
+        <w:t>🔄 Task 25: Utilities Implementation</w:t>
       </w:r>
     </w:p>
     <w:p>
@@ -975,6 +1875,194 @@
         <w:t>Status</w:t>
       </w:r>
       <w:r>
+        <w:t>: PARTIALLY COMPLETED</w:t>
+      </w:r>
+    </w:p>
+    <w:p>
+      <w:r/>
+      <w:r>
+        <w:rPr>
+          <w:b/>
+        </w:rPr>
+        <w:t>Programmers</w:t>
+      </w:r>
+      <w:r>
+        <w:t>: JasonUranta (scripts/fetch-issue-comments.py utilities)</w:t>
+      </w:r>
+    </w:p>
+    <w:p>
+      <w:r/>
+      <w:r>
+        <w:rPr>
+          <w:b/>
+        </w:rPr>
+        <w:t>Existing Work</w:t>
+      </w:r>
+      <w:r>
+        <w:t>:</w:t>
+      </w:r>
+    </w:p>
+    <w:p>
+      <w:r>
+        <w:t xml:space="preserve">- </w:t>
+      </w:r>
+      <w:r>
+        <w:rPr>
+          <w:b/>
+        </w:rPr>
+        <w:t>scripts/fetch-issue-comments.py</w:t>
+      </w:r>
+      <w:r>
+        <w:t xml:space="preserve"> by JasonUranta implements several utility functions:</w:t>
+      </w:r>
+    </w:p>
+    <w:p>
+      <w:pPr>
+        <w:pStyle w:val="ListBullet"/>
+      </w:pPr>
+      <w:r>
+        <w:t>`save_json_atomic()`: Atomic JSON writes with temp file + rename pattern</w:t>
+      </w:r>
+    </w:p>
+    <w:p>
+      <w:pPr>
+        <w:pStyle w:val="ListBullet"/>
+      </w:pPr>
+      <w:r>
+        <w:t>`_iso()`: ISO timestamp formatting</w:t>
+      </w:r>
+    </w:p>
+    <w:p>
+      <w:pPr>
+        <w:pStyle w:val="ListBullet"/>
+      </w:pPr>
+      <w:r>
+        <w:t>`_parse_iso()`: ISO timestamp parsing</w:t>
+      </w:r>
+    </w:p>
+    <w:p>
+      <w:pPr>
+        <w:pStyle w:val="ListBullet"/>
+      </w:pPr>
+      <w:r>
+        <w:t>`_min_updated()`: Find minimum update timestamp</w:t>
+      </w:r>
+    </w:p>
+    <w:p>
+      <w:pPr>
+        <w:pStyle w:val="ListBullet"/>
+      </w:pPr>
+      <w:r>
+        <w:t>Logging setup using Python's logging module</w:t>
+      </w:r>
+    </w:p>
+    <w:p>
+      <w:pPr>
+        <w:pStyle w:val="ListBullet"/>
+      </w:pPr>
+      <w:r>
+        <w:t>File I/O helpers (read_etag, write_etag, read_meta, write_meta)</w:t>
+      </w:r>
+    </w:p>
+    <w:p>
+      <w:r>
+        <w:t xml:space="preserve">- </w:t>
+      </w:r>
+      <w:r>
+        <w:rPr>
+          <w:b/>
+        </w:rPr>
+        <w:t>API_repo_labels/scripts/repo_labeler.py</w:t>
+      </w:r>
+      <w:r>
+        <w:t xml:space="preserve"> implements:</w:t>
+      </w:r>
+    </w:p>
+    <w:p>
+      <w:pPr>
+        <w:pStyle w:val="ListBullet"/>
+      </w:pPr>
+      <w:r>
+        <w:t>Retry logic with exponential backoff</w:t>
+      </w:r>
+    </w:p>
+    <w:p>
+      <w:pPr>
+        <w:pStyle w:val="ListBullet"/>
+      </w:pPr>
+      <w:r>
+        <w:t>Rate limit handling utilities</w:t>
+      </w:r>
+    </w:p>
+    <w:p>
+      <w:r/>
+      <w:r>
+        <w:rPr>
+          <w:b/>
+        </w:rPr>
+        <w:t>Remaining Work</w:t>
+      </w:r>
+      <w:r>
+        <w:t>:</w:t>
+      </w:r>
+    </w:p>
+    <w:p>
+      <w:pPr>
+        <w:pStyle w:val="ListBullet"/>
+      </w:pPr>
+      <w:r>
+        <w:t>Consolidate utility functions into `src/utils.py`</w:t>
+      </w:r>
+    </w:p>
+    <w:p>
+      <w:pPr>
+        <w:pStyle w:val="ListBullet"/>
+      </w:pPr>
+      <w:r>
+        <w:t>Add temp file management for: comments, prompts, responses, logs per issue</w:t>
+      </w:r>
+    </w:p>
+    <w:p>
+      <w:pPr>
+        <w:pStyle w:val="ListBullet"/>
+      </w:pPr>
+      <w:r>
+        <w:t>Ensure temp files are gitignored and outputs are committed</w:t>
+      </w:r>
+    </w:p>
+    <w:p/>
+    <w:p>
+      <w:r>
+        <w:t>________________________________________________________________________________</w:t>
+      </w:r>
+    </w:p>
+    <w:p/>
+    <w:p>
+      <w:pPr>
+        <w:pStyle w:val="Heading2"/>
+      </w:pPr>
+      <w:r>
+        <w:t>Phase 3: Pipeline Orchestration (Tasks 26-28)</w:t>
+      </w:r>
+    </w:p>
+    <w:p/>
+    <w:p>
+      <w:pPr>
+        <w:pStyle w:val="Heading3"/>
+      </w:pPr>
+      <w:r>
+        <w:t>⏳ Task 26: Pipeline Implementation</w:t>
+      </w:r>
+    </w:p>
+    <w:p>
+      <w:r/>
+      <w:r>
+        <w:rPr>
+          <w:b/>
+        </w:rPr>
+        <w:t>Status</w:t>
+      </w:r>
+      <w:r>
         <w:t>: PENDING</w:t>
       </w:r>
     </w:p>
@@ -987,31 +2075,16 @@
         <w:t>Description</w:t>
       </w:r>
       <w:r>
-        <w:t>: Create tests/test_label_applier.py with unit tests for GitHub API label application and error handling</w:t>
+        <w:t>: Implement src/pipeline.py: process_issue() with configurable skill output mode (api_labels, comment_checklist, or both), process_contributors(), log_pipeline_activity() with 1-minute timeout</w:t>
       </w:r>
     </w:p>
     <w:p/>
     <w:p>
-      <w:r>
-        <w:t>________________________________________________________________________________</w:t>
-      </w:r>
-    </w:p>
-    <w:p/>
-    <w:p>
-      <w:pPr>
-        <w:pStyle w:val="Heading2"/>
-      </w:pPr>
-      <w:r>
-        <w:t>Phase 2: Core Modules - Comment Posting (Tasks 20-23)</w:t>
-      </w:r>
-    </w:p>
-    <w:p/>
-    <w:p>
       <w:pPr>
         <w:pStyle w:val="Heading3"/>
       </w:pPr>
       <w:r>
-        <w:t>⏳ Task 20: Comment Poster Implementation</w:t>
+        <w:t>⏳ Task 27: Pipeline Tests</w:t>
       </w:r>
     </w:p>
     <w:p>
@@ -1035,7 +2108,7 @@
         <w:t>Description</w:t>
       </w:r>
       <w:r>
-        <w:t>: Implement src/comment_poster.py: format_resume_comment(), format_skill_checklist_comment(), post_comment() using bot account with mode configuration for comment vs. API labels</w:t>
+        <w:t>: Create tests/test_pipeline.py with end-to-end integration tests for all three skill output modes</w:t>
       </w:r>
     </w:p>
     <w:p/>
@@ -1044,7 +2117,7 @@
         <w:pStyle w:val="Heading3"/>
       </w:pPr>
       <w:r>
-        <w:t>⏳ Task 21: Resume Bullet Template Design</w:t>
+        <w:t>⏳ Task 28: CLI Entry Point</w:t>
       </w:r>
     </w:p>
     <w:p>
@@ -1068,16 +2141,31 @@
         <w:t>Description</w:t>
       </w:r>
       <w:r>
-        <w:t>: Design resume bullet comment template: opening message with automation link, bullets grouped by @username</w:t>
+        <w:t>: Implement scripts/run_poc.py: CLI entry point for GitHub Actions runner with arguments (--issue, --contributors, --dry-run, --skill-mode [api|comment|both]), progress reporting</w:t>
       </w:r>
     </w:p>
     <w:p/>
     <w:p>
+      <w:r>
+        <w:t>________________________________________________________________________________</w:t>
+      </w:r>
+    </w:p>
+    <w:p/>
+    <w:p>
+      <w:pPr>
+        <w:pStyle w:val="Heading2"/>
+      </w:pPr>
+      <w:r>
+        <w:t>Phase 4: Error Handling &amp; Logging (Tasks 29-32)</w:t>
+      </w:r>
+    </w:p>
+    <w:p/>
+    <w:p>
       <w:pPr>
         <w:pStyle w:val="Heading3"/>
       </w:pPr>
       <w:r>
-        <w:t>⏳ Task 22: Skill Label Template Design</w:t>
+        <w:t>🔄 Task 29: Error Handling Implementation</w:t>
       </w:r>
     </w:p>
     <w:p>
@@ -1089,7 +2177,7 @@
         <w:t>Status</w:t>
       </w:r>
       <w:r>
-        <w:t>: PENDING</w:t>
+        <w:t>: PARTIALLY COMPLETED</w:t>
       </w:r>
     </w:p>
     <w:p>
@@ -1098,10 +2186,134 @@
         <w:rPr>
           <w:b/>
         </w:rPr>
-        <w:t>Description</w:t>
-      </w:r>
-      <w:r>
-        <w:t>: Design skill label comment template: opening message, markdown checklist format with - [ ] Python, - [ ] Project Management (only used if SKILL_OUTPUT_MODE=comment)</w:t>
+        <w:t>Programmers</w:t>
+      </w:r>
+      <w:r>
+        <w:t>: JasonUranta (scripts/fetch-issue-comments.py)</w:t>
+      </w:r>
+    </w:p>
+    <w:p>
+      <w:r/>
+      <w:r>
+        <w:rPr>
+          <w:b/>
+        </w:rPr>
+        <w:t>Existing Work</w:t>
+      </w:r>
+      <w:r>
+        <w:t>:</w:t>
+      </w:r>
+    </w:p>
+    <w:p>
+      <w:r>
+        <w:t xml:space="preserve">- </w:t>
+      </w:r>
+      <w:r>
+        <w:rPr>
+          <w:b/>
+        </w:rPr>
+        <w:t>scripts/fetch-issue-comments.py</w:t>
+      </w:r>
+      <w:r>
+        <w:t xml:space="preserve"> by JasonUranta implements error handling:</w:t>
+      </w:r>
+    </w:p>
+    <w:p>
+      <w:pPr>
+        <w:pStyle w:val="ListBullet"/>
+      </w:pPr>
+      <w:r>
+        <w:t>Try-except blocks for network errors, JSON parsing errors</w:t>
+      </w:r>
+    </w:p>
+    <w:p>
+      <w:pPr>
+        <w:pStyle w:val="ListBullet"/>
+      </w:pPr>
+      <w:r>
+        <w:t>Logging of errors with logger.error() and logger.warning()</w:t>
+      </w:r>
+    </w:p>
+    <w:p>
+      <w:pPr>
+        <w:pStyle w:val="ListBullet"/>
+      </w:pPr>
+      <w:r>
+        <w:t>Specific handling for different HTTP status codes (401, 404, 422, 500, 502, 503, 504)</w:t>
+      </w:r>
+    </w:p>
+    <w:p>
+      <w:pPr>
+        <w:pStyle w:val="ListBullet"/>
+      </w:pPr>
+      <w:r>
+        <w:t>Graceful degradation with partial failure tolerance</w:t>
+      </w:r>
+    </w:p>
+    <w:p>
+      <w:r>
+        <w:t xml:space="preserve">- </w:t>
+      </w:r>
+      <w:r>
+        <w:rPr>
+          <w:b/>
+        </w:rPr>
+        <w:t>API_repo_labels/scripts/repo_labeler.py</w:t>
+      </w:r>
+      <w:r>
+        <w:t xml:space="preserve"> implements:</w:t>
+      </w:r>
+    </w:p>
+    <w:p>
+      <w:pPr>
+        <w:pStyle w:val="ListBullet"/>
+      </w:pPr>
+      <w:r>
+        <w:t>Error detection and logging</w:t>
+      </w:r>
+    </w:p>
+    <w:p>
+      <w:pPr>
+        <w:pStyle w:val="ListBullet"/>
+      </w:pPr>
+      <w:r>
+        <w:t>Retry logic for transient errors</w:t>
+      </w:r>
+    </w:p>
+    <w:p>
+      <w:r/>
+      <w:r>
+        <w:rPr>
+          <w:b/>
+        </w:rPr>
+        <w:t>Remaining Work</w:t>
+      </w:r>
+      <w:r>
+        <w:t>:</w:t>
+      </w:r>
+    </w:p>
+    <w:p>
+      <w:pPr>
+        <w:pStyle w:val="ListBullet"/>
+      </w:pPr>
+      <w:r>
+        <w:t>Add functionality to post public error messages to GitHub issues</w:t>
+      </w:r>
+    </w:p>
+    <w:p>
+      <w:pPr>
+        <w:pStyle w:val="ListBullet"/>
+      </w:pPr>
+      <w:r>
+        <w:t>Create structured error log file (stored in repo)</w:t>
+      </w:r>
+    </w:p>
+    <w:p>
+      <w:pPr>
+        <w:pStyle w:val="ListBullet"/>
+      </w:pPr>
+      <w:r>
+        <w:t>Implement user-friendly error messages with error codes</w:t>
       </w:r>
     </w:p>
     <w:p/>
@@ -1110,7 +2322,7 @@
         <w:pStyle w:val="Heading3"/>
       </w:pPr>
       <w:r>
-        <w:t>⏳ Task 23: Comment Poster Tests</w:t>
+        <w:t>🔄 Task 30: Rate Limiting Implementation</w:t>
       </w:r>
     </w:p>
     <w:p>
@@ -1122,7 +2334,7 @@
         <w:t>Status</w:t>
       </w:r>
       <w:r>
-        <w:t>: PENDING</w:t>
+        <w:t>: PARTIALLY COMPLETED (GitHub API only)</w:t>
       </w:r>
     </w:p>
     <w:p>
@@ -1131,34 +2343,10 @@
         <w:rPr>
           <w:b/>
         </w:rPr>
-        <w:t>Description</w:t>
-      </w:r>
-      <w:r>
-        <w:t>: Create tests/test_comment_poster.py with unit tests for both comment formats and posting logic</w:t>
-      </w:r>
-    </w:p>
-    <w:p/>
-    <w:p>
-      <w:r>
-        <w:t>________________________________________________________________________________</w:t>
-      </w:r>
-    </w:p>
-    <w:p/>
-    <w:p>
-      <w:pPr>
-        <w:pStyle w:val="Heading2"/>
-      </w:pPr>
-      <w:r>
-        <w:t>Phase 2: Core Modules - Output &amp; Utils (Tasks 24-25)</w:t>
-      </w:r>
-    </w:p>
-    <w:p/>
-    <w:p>
-      <w:pPr>
-        <w:pStyle w:val="Heading3"/>
-      </w:pPr>
-      <w:r>
-        <w:t>⏳ Task 24: Output Writer Implementation</w:t>
+        <w:t>Programmers</w:t>
+      </w:r>
+      <w:r>
+        <w:t>: JasonUranta (scripts/fetch-issue-comments.py)</w:t>
       </w:r>
     </w:p>
     <w:p>
@@ -1167,79 +2355,156 @@
         <w:rPr>
           <w:b/>
         </w:rPr>
-        <w:t>Status</w:t>
-      </w:r>
-      <w:r>
-        <w:t>: PENDING</w:t>
-      </w:r>
-    </w:p>
-    <w:p>
-      <w:r/>
+        <w:t>Existing Work - GitHub API Rate Limiting</w:t>
+      </w:r>
+      <w:r>
+        <w:t>:</w:t>
+      </w:r>
+    </w:p>
+    <w:p>
+      <w:r>
+        <w:t xml:space="preserve">- </w:t>
+      </w:r>
       <w:r>
         <w:rPr>
           <w:b/>
         </w:rPr>
-        <w:t>Description</w:t>
-      </w:r>
-      <w:r>
-        <w:t>: Implement src/output_writer.py: save CSV/JSON files to data/output/ in repo (bot commits these files back to repo), schema: contributor_id, contributor_name, issue_id, resume_bullets, skill_labels</w:t>
-      </w:r>
-    </w:p>
-    <w:p/>
-    <w:p>
-      <w:pPr>
-        <w:pStyle w:val="Heading3"/>
-      </w:pPr>
-      <w:r>
-        <w:t>⏳ Task 25: Utilities Implementation</w:t>
-      </w:r>
-    </w:p>
-    <w:p>
-      <w:r/>
+        <w:t>scripts/fetch-issue-comments.py</w:t>
+      </w:r>
+      <w:r>
+        <w:t xml:space="preserve"> by JasonUranta (comprehensive implementation):</w:t>
+      </w:r>
+    </w:p>
+    <w:p>
+      <w:pPr>
+        <w:pStyle w:val="ListBullet"/>
+      </w:pPr>
+      <w:r>
+        <w:t>Handles 403/429 status codes</w:t>
+      </w:r>
+    </w:p>
+    <w:p>
+      <w:pPr>
+        <w:pStyle w:val="ListBullet"/>
+      </w:pPr>
+      <w:r>
+        <w:t>Respects X-RateLimit-Remaining header</w:t>
+      </w:r>
+    </w:p>
+    <w:p>
+      <w:pPr>
+        <w:pStyle w:val="ListBullet"/>
+      </w:pPr>
+      <w:r>
+        <w:t>Secondary rate limit detection ("secondary rate limit", "abuse detection" in response body)</w:t>
+      </w:r>
+    </w:p>
+    <w:p>
+      <w:pPr>
+        <w:pStyle w:val="ListBullet"/>
+      </w:pPr>
+      <w:r>
+        <w:t>Retry-After header parsing (both delta-seconds and HTTP-date formats)</w:t>
+      </w:r>
+    </w:p>
+    <w:p>
+      <w:pPr>
+        <w:pStyle w:val="ListBullet"/>
+      </w:pPr>
+      <w:r>
+        <w:t>X-RateLimit-Reset header support</w:t>
+      </w:r>
+    </w:p>
+    <w:p>
+      <w:pPr>
+        <w:pStyle w:val="ListBullet"/>
+      </w:pPr>
+      <w:r>
+        <w:t>Exponential backoff (BASE_BACKOFF=5s, MAX_BACKOFF=60s)</w:t>
+      </w:r>
+    </w:p>
+    <w:p>
+      <w:pPr>
+        <w:pStyle w:val="ListBullet"/>
+      </w:pPr>
+      <w:r>
+        <w:t>Sleep budget tracking (MAX_TOTAL_SLEEP=600s per endpoint)</w:t>
+      </w:r>
+    </w:p>
+    <w:p>
+      <w:pPr>
+        <w:pStyle w:val="ListBullet"/>
+      </w:pPr>
+      <w:r>
+        <w:t>Jitter addition to prevent thundering herd</w:t>
+      </w:r>
+    </w:p>
+    <w:p>
+      <w:r>
+        <w:t xml:space="preserve">- </w:t>
+      </w:r>
       <w:r>
         <w:rPr>
           <w:b/>
         </w:rPr>
-        <w:t>Status</w:t>
-      </w:r>
-      <w:r>
-        <w:t>: PENDING</w:t>
-      </w:r>
-    </w:p>
-    <w:p>
-      <w:r/>
+        <w:t>API_repo_labels/scripts/repo_labeler.py</w:t>
+      </w:r>
+      <w:r>
+        <w:t>:</w:t>
+      </w:r>
+    </w:p>
+    <w:p>
+      <w:pPr>
+        <w:pStyle w:val="ListBullet"/>
+      </w:pPr>
+      <w:r>
+        <w:t>Primary rate limit handling (X-RateLimit-Remaining)</w:t>
+      </w:r>
+    </w:p>
+    <w:p>
+      <w:pPr>
+        <w:pStyle w:val="ListBullet"/>
+      </w:pPr>
+      <w:r>
+        <w:t>Secondary rate limit detection</w:t>
+      </w:r>
+    </w:p>
+    <w:p>
+      <w:pPr>
+        <w:pStyle w:val="ListBullet"/>
+      </w:pPr>
+      <w:r>
+        <w:t>Exponential backoff (starts at 5s, max 60s)</w:t>
+      </w:r>
+    </w:p>
+    <w:p>
+      <w:pPr>
+        <w:pStyle w:val="ListBullet"/>
+      </w:pPr>
+      <w:r>
+        <w:t>Batch rest every 10 successful creations</w:t>
+      </w:r>
+    </w:p>
+    <w:p>
+      <w:r>
+        <w:t xml:space="preserve">- </w:t>
+      </w:r>
       <w:r>
         <w:rPr>
           <w:b/>
         </w:rPr>
-        <w:t>Description</w:t>
-      </w:r>
-      <w:r>
-        <w:t>: Implement src/utils.py: logging utilities, file I/O helpers, temp file management (comments, prompts, responses, logs per issue) - temp files gitignored, outputs committed</w:t>
-      </w:r>
-    </w:p>
-    <w:p/>
-    <w:p>
-      <w:r>
-        <w:t>________________________________________________________________________________</w:t>
-      </w:r>
-    </w:p>
-    <w:p/>
-    <w:p>
-      <w:pPr>
-        <w:pStyle w:val="Heading2"/>
-      </w:pPr>
-      <w:r>
-        <w:t>Phase 3: Pipeline Orchestration (Tasks 26-28)</w:t>
-      </w:r>
-    </w:p>
-    <w:p/>
-    <w:p>
-      <w:pPr>
-        <w:pStyle w:val="Heading3"/>
-      </w:pPr>
-      <w:r>
-        <w:t>⏳ Task 26: Pipeline Implementation</w:t>
+        <w:t>API_repo_labels/scripts/label_delete.py</w:t>
+      </w:r>
+      <w:r>
+        <w:t>:</w:t>
+      </w:r>
+    </w:p>
+    <w:p>
+      <w:pPr>
+        <w:pStyle w:val="ListBullet"/>
+      </w:pPr>
+      <w:r>
+        <w:t>Retry logic with exponential backoff for 403 responses</w:t>
       </w:r>
     </w:p>
     <w:p>
@@ -1248,169 +2513,26 @@
         <w:rPr>
           <w:b/>
         </w:rPr>
-        <w:t>Status</w:t>
-      </w:r>
-      <w:r>
-        <w:t>: PENDING</w:t>
-      </w:r>
-    </w:p>
-    <w:p>
-      <w:r/>
-      <w:r>
-        <w:rPr>
-          <w:b/>
-        </w:rPr>
-        <w:t>Description</w:t>
-      </w:r>
-      <w:r>
-        <w:t>: Implement src/pipeline.py: process_issue() with configurable skill output mode (api_labels, comment_checklist, or both), process_contributors(), log_pipeline_activity() with 1-minute timeout</w:t>
-      </w:r>
-    </w:p>
-    <w:p/>
-    <w:p>
-      <w:pPr>
-        <w:pStyle w:val="Heading3"/>
-      </w:pPr>
-      <w:r>
-        <w:t>⏳ Task 27: Pipeline Tests</w:t>
-      </w:r>
-    </w:p>
-    <w:p>
-      <w:r/>
-      <w:r>
-        <w:rPr>
-          <w:b/>
-        </w:rPr>
-        <w:t>Status</w:t>
-      </w:r>
-      <w:r>
-        <w:t>: PENDING</w:t>
-      </w:r>
-    </w:p>
-    <w:p>
-      <w:r/>
-      <w:r>
-        <w:rPr>
-          <w:b/>
-        </w:rPr>
-        <w:t>Description</w:t>
-      </w:r>
-      <w:r>
-        <w:t>: Create tests/test_pipeline.py with end-to-end integration tests for all three skill output modes</w:t>
-      </w:r>
-    </w:p>
-    <w:p/>
-    <w:p>
-      <w:pPr>
-        <w:pStyle w:val="Heading3"/>
-      </w:pPr>
-      <w:r>
-        <w:t>⏳ Task 28: CLI Entry Point</w:t>
-      </w:r>
-    </w:p>
-    <w:p>
-      <w:r/>
-      <w:r>
-        <w:rPr>
-          <w:b/>
-        </w:rPr>
-        <w:t>Status</w:t>
-      </w:r>
-      <w:r>
-        <w:t>: PENDING</w:t>
-      </w:r>
-    </w:p>
-    <w:p>
-      <w:r/>
-      <w:r>
-        <w:rPr>
-          <w:b/>
-        </w:rPr>
-        <w:t>Description</w:t>
-      </w:r>
-      <w:r>
-        <w:t>: Implement scripts/run_poc.py: CLI entry point for GitHub Actions runner with arguments (--issue, --contributors, --dry-run, --skill-mode [api|comment|both]), progress reporting</w:t>
-      </w:r>
-    </w:p>
-    <w:p/>
-    <w:p>
-      <w:r>
-        <w:t>________________________________________________________________________________</w:t>
-      </w:r>
-    </w:p>
-    <w:p/>
-    <w:p>
-      <w:pPr>
-        <w:pStyle w:val="Heading2"/>
-      </w:pPr>
-      <w:r>
-        <w:t>Phase 4: Error Handling &amp; Logging (Tasks 29-32)</w:t>
-      </w:r>
-    </w:p>
-    <w:p/>
-    <w:p>
-      <w:pPr>
-        <w:pStyle w:val="Heading3"/>
-      </w:pPr>
-      <w:r>
-        <w:t>⏳ Task 29: Error Handling Implementation</w:t>
-      </w:r>
-    </w:p>
-    <w:p>
-      <w:r/>
-      <w:r>
-        <w:rPr>
-          <w:b/>
-        </w:rPr>
-        <w:t>Status</w:t>
-      </w:r>
-      <w:r>
-        <w:t>: PENDING</w:t>
-      </w:r>
-    </w:p>
-    <w:p>
-      <w:r/>
-      <w:r>
-        <w:rPr>
-          <w:b/>
-        </w:rPr>
-        <w:t>Description</w:t>
-      </w:r>
-      <w:r>
-        <w:t>: Implement error handling: post public error messages to issues with error code and user-friendly message, log full error details to structured error log (stored in repo)</w:t>
-      </w:r>
-    </w:p>
-    <w:p/>
-    <w:p>
-      <w:pPr>
-        <w:pStyle w:val="Heading3"/>
-      </w:pPr>
-      <w:r>
-        <w:t>⏳ Task 30: Rate Limiting Implementation</w:t>
-      </w:r>
-    </w:p>
-    <w:p>
-      <w:r/>
-      <w:r>
-        <w:rPr>
-          <w:b/>
-        </w:rPr>
-        <w:t>Status</w:t>
-      </w:r>
-      <w:r>
-        <w:t>: PENDING</w:t>
-      </w:r>
-    </w:p>
-    <w:p>
-      <w:r/>
-      <w:r>
-        <w:rPr>
-          <w:b/>
-        </w:rPr>
-        <w:t>Description</w:t>
-      </w:r>
-      <w:r>
-        <w:t>: Implement rate limiting with throttling logic: respect OpenAI Tier 1 limits (500 RPM, 30K TPM) and GitHub API limits, implement exponential backoff</w:t>
+        <w:t>Remaining Work</w:t>
+      </w:r>
+      <w:r>
+        <w:t>:</w:t>
+      </w:r>
+    </w:p>
+    <w:p>
+      <w:pPr>
+        <w:pStyle w:val="ListBullet"/>
+      </w:pPr>
+      <w:r>
+        <w:t>Implement OpenAI Tier 1 rate limiting (500 RPM, 30K TPM)</w:t>
+      </w:r>
+    </w:p>
+    <w:p>
+      <w:pPr>
+        <w:pStyle w:val="ListBullet"/>
+      </w:pPr>
+      <w:r>
+        <w:t>Consolidate GitHub rate limiting into src/utils.py or src/github_fetcher.py</w:t>
       </w:r>
     </w:p>
     <w:p/>
@@ -2328,6 +3450,691 @@
       </w:r>
       <w:r>
         <w:t>: HfLA_skills.csv</w:t>
+      </w:r>
+    </w:p>
+    <w:p/>
+    <w:p>
+      <w:r>
+        <w:t>________________________________________________________________________________</w:t>
+      </w:r>
+    </w:p>
+    <w:p/>
+    <w:p>
+      <w:pPr>
+        <w:pStyle w:val="Heading2"/>
+      </w:pPr>
+      <w:r>
+        <w:t>📊 Code Completion Summary</w:t>
+      </w:r>
+    </w:p>
+    <w:p/>
+    <w:p>
+      <w:pPr>
+        <w:pStyle w:val="Heading3"/>
+      </w:pPr>
+      <w:r>
+        <w:t>Existing Code Assets (R&amp;D Work)</w:t>
+      </w:r>
+    </w:p>
+    <w:p/>
+    <w:p>
+      <w:r>
+        <w:t>The following scripts contain substantial functionality that can be consolidated into AISA_Bot:</w:t>
+      </w:r>
+    </w:p>
+    <w:p/>
+    <w:p>
+      <w:r>
+        <w:t xml:space="preserve">1. </w:t>
+      </w:r>
+      <w:r>
+        <w:rPr>
+          <w:b/>
+        </w:rPr>
+        <w:t>scripts/fetch-issue-comments.py</w:t>
+      </w:r>
+      <w:r>
+        <w:t xml:space="preserve"> (672 lines) - </w:t>
+      </w:r>
+      <w:r>
+        <w:rPr>
+          <w:b/>
+        </w:rPr>
+        <w:t>JasonUranta</w:t>
+      </w:r>
+      <w:r/>
+    </w:p>
+    <w:p>
+      <w:pPr>
+        <w:pStyle w:val="ListBullet"/>
+      </w:pPr>
+      <w:r>
+        <w:t>Comprehensive GitHub issue/PR comment fetcher</w:t>
+      </w:r>
+    </w:p>
+    <w:p>
+      <w:pPr>
+        <w:pStyle w:val="ListBullet"/>
+      </w:pPr>
+      <w:r>
+        <w:t>Incremental sync, ETag support, watermarks</w:t>
+      </w:r>
+    </w:p>
+    <w:p>
+      <w:pPr>
+        <w:pStyle w:val="ListBullet"/>
+      </w:pPr>
+      <w:r>
+        <w:t>Sophisticated rate limiting and error handling</w:t>
+      </w:r>
+    </w:p>
+    <w:p>
+      <w:pPr>
+        <w:pStyle w:val="ListBullet"/>
+      </w:pPr>
+      <w:r>
+        <w:t>Maps to: Task 9 (github_fetcher.py), Task 25 (utils.py), Task 29 (error handling), Task 30 (rate limiting)</w:t>
+      </w:r>
+    </w:p>
+    <w:p/>
+    <w:p>
+      <w:r>
+        <w:t xml:space="preserve">2. </w:t>
+      </w:r>
+      <w:r>
+        <w:rPr>
+          <w:b/>
+        </w:rPr>
+        <w:t>API_repo_labels/scripts/repo_labeler.py</w:t>
+      </w:r>
+      <w:r>
+        <w:t xml:space="preserve"> (173 lines) - </w:t>
+      </w:r>
+      <w:r>
+        <w:rPr>
+          <w:b/>
+        </w:rPr>
+        <w:t>Programmer TBD</w:t>
+      </w:r>
+      <w:r/>
+    </w:p>
+    <w:p>
+      <w:pPr>
+        <w:pStyle w:val="ListBullet"/>
+      </w:pPr>
+      <w:r>
+        <w:t>Label creation via GitHub API</w:t>
+      </w:r>
+    </w:p>
+    <w:p>
+      <w:pPr>
+        <w:pStyle w:val="ListBullet"/>
+      </w:pPr>
+      <w:r>
+        <w:t>Deduplication, rate limiting, batch processing</w:t>
+      </w:r>
+    </w:p>
+    <w:p>
+      <w:pPr>
+        <w:pStyle w:val="ListBullet"/>
+      </w:pPr>
+      <w:r>
+        <w:t>Maps to: Task 17 (label_applier.py), Task 30 (rate limiting)</w:t>
+      </w:r>
+    </w:p>
+    <w:p/>
+    <w:p>
+      <w:r>
+        <w:t xml:space="preserve">3. </w:t>
+      </w:r>
+      <w:r>
+        <w:rPr>
+          <w:b/>
+        </w:rPr>
+        <w:t>API_repo_labels/scripts/excel_to_json.py</w:t>
+      </w:r>
+      <w:r>
+        <w:t xml:space="preserve"> - </w:t>
+      </w:r>
+      <w:r>
+        <w:rPr>
+          <w:b/>
+        </w:rPr>
+        <w:t>Programmer TBD</w:t>
+      </w:r>
+      <w:r/>
+    </w:p>
+    <w:p>
+      <w:pPr>
+        <w:pStyle w:val="ListBullet"/>
+      </w:pPr>
+      <w:r>
+        <w:t>Taxonomy loading and conversion</w:t>
+      </w:r>
+    </w:p>
+    <w:p>
+      <w:pPr>
+        <w:pStyle w:val="ListBullet"/>
+      </w:pPr>
+      <w:r>
+        <w:t>Maps to: Task 11 (prompt_builder.py - load_taxonomy())</w:t>
+      </w:r>
+    </w:p>
+    <w:p/>
+    <w:p>
+      <w:r>
+        <w:t xml:space="preserve">4. </w:t>
+      </w:r>
+      <w:r>
+        <w:rPr>
+          <w:b/>
+        </w:rPr>
+        <w:t>issue_contributor_fetcher/org_fetcher/org_fetcher.py</w:t>
+      </w:r>
+      <w:r>
+        <w:t xml:space="preserve"> (226 lines) - </w:t>
+      </w:r>
+      <w:r>
+        <w:rPr>
+          <w:b/>
+        </w:rPr>
+        <w:t>Sandy3w</w:t>
+      </w:r>
+      <w:r/>
+    </w:p>
+    <w:p>
+      <w:pPr>
+        <w:pStyle w:val="ListBullet"/>
+      </w:pPr>
+      <w:r>
+        <w:t>Organization-level contribution fetching</w:t>
+      </w:r>
+    </w:p>
+    <w:p>
+      <w:pPr>
+        <w:pStyle w:val="ListBullet"/>
+      </w:pPr>
+      <w:r>
+        <w:t>Maps to: Task 9 (github_fetcher.py - fetch_issues_for_contributors())</w:t>
+      </w:r>
+    </w:p>
+    <w:p/>
+    <w:p>
+      <w:r>
+        <w:t xml:space="preserve">5. </w:t>
+      </w:r>
+      <w:r>
+        <w:rPr>
+          <w:b/>
+        </w:rPr>
+        <w:t>issue_contributor_fetcher/repo_fetcher/repo_fetcher.py</w:t>
+      </w:r>
+      <w:r>
+        <w:t xml:space="preserve"> (172 lines) - </w:t>
+      </w:r>
+      <w:r>
+        <w:rPr>
+          <w:b/>
+        </w:rPr>
+        <w:t>Sandy3w</w:t>
+      </w:r>
+      <w:r/>
+    </w:p>
+    <w:p>
+      <w:pPr>
+        <w:pStyle w:val="ListBullet"/>
+      </w:pPr>
+      <w:r>
+        <w:t>Repository-level contribution fetching</w:t>
+      </w:r>
+    </w:p>
+    <w:p>
+      <w:pPr>
+        <w:pStyle w:val="ListBullet"/>
+      </w:pPr>
+      <w:r>
+        <w:t>Maps to: Task 9 (github_fetcher.py - fetch_issues_for_contributors())</w:t>
+      </w:r>
+    </w:p>
+    <w:p/>
+    <w:p>
+      <w:r>
+        <w:t xml:space="preserve">6. </w:t>
+      </w:r>
+      <w:r>
+        <w:rPr>
+          <w:b/>
+        </w:rPr>
+        <w:t>API_repo_labels/scripts/label_delete.py</w:t>
+      </w:r>
+      <w:r>
+        <w:t xml:space="preserve"> - </w:t>
+      </w:r>
+      <w:r>
+        <w:rPr>
+          <w:b/>
+        </w:rPr>
+        <w:t>Programmer TBD</w:t>
+      </w:r>
+      <w:r/>
+    </w:p>
+    <w:p>
+      <w:pPr>
+        <w:pStyle w:val="ListBullet"/>
+      </w:pPr>
+      <w:r>
+        <w:t>Label deletion with retry logic</w:t>
+      </w:r>
+    </w:p>
+    <w:p>
+      <w:pPr>
+        <w:pStyle w:val="ListBullet"/>
+      </w:pPr>
+      <w:r>
+        <w:t>Maps to: Task 30 (rate limiting patterns)</w:t>
+      </w:r>
+    </w:p>
+    <w:p/>
+    <w:p>
+      <w:r>
+        <w:t xml:space="preserve">7. </w:t>
+      </w:r>
+      <w:r>
+        <w:rPr>
+          <w:b/>
+        </w:rPr>
+        <w:t>LLM Prompt Research</w:t>
+      </w:r>
+      <w:r>
+        <w:t xml:space="preserve"> - </w:t>
+      </w:r>
+      <w:r>
+        <w:rPr>
+          <w:b/>
+        </w:rPr>
+        <w:t>chinaexpert1</w:t>
+      </w:r>
+      <w:r/>
+    </w:p>
+    <w:p>
+      <w:pPr>
+        <w:pStyle w:val="ListBullet"/>
+      </w:pPr>
+      <w:r>
+        <w:t>Research completed for Task 12 (LLM prompt design)</w:t>
+      </w:r>
+    </w:p>
+    <w:p>
+      <w:pPr>
+        <w:pStyle w:val="ListBullet"/>
+      </w:pPr>
+      <w:r>
+        <w:t>Awaiting implementation from Sandy3w</w:t>
+      </w:r>
+    </w:p>
+    <w:p/>
+    <w:p>
+      <w:pPr>
+        <w:pStyle w:val="Heading3"/>
+      </w:pPr>
+      <w:r>
+        <w:t>Completion Status by Phase</w:t>
+      </w:r>
+    </w:p>
+    <w:p/>
+    <w:p>
+      <w:r>
+        <w:t xml:space="preserve">- </w:t>
+      </w:r>
+      <w:r>
+        <w:rPr>
+          <w:b/>
+        </w:rPr>
+        <w:t>Phase 1 (Setup)</w:t>
+      </w:r>
+      <w:r>
+        <w:t>: 1 completed, 3 partially completed, 4 pending</w:t>
+      </w:r>
+    </w:p>
+    <w:p>
+      <w:r>
+        <w:t xml:space="preserve">- </w:t>
+      </w:r>
+      <w:r>
+        <w:rPr>
+          <w:b/>
+        </w:rPr>
+        <w:t>Phase 2 (Core Modules)</w:t>
+      </w:r>
+      <w:r>
+        <w:t>: 0 completed, 4 partially completed, 11 pending</w:t>
+      </w:r>
+    </w:p>
+    <w:p>
+      <w:r>
+        <w:t xml:space="preserve">- </w:t>
+      </w:r>
+      <w:r>
+        <w:rPr>
+          <w:b/>
+        </w:rPr>
+        <w:t>Phase 3 (Pipeline)</w:t>
+      </w:r>
+      <w:r>
+        <w:t>: 0 completed, 0 partially completed, 3 pending</w:t>
+      </w:r>
+    </w:p>
+    <w:p>
+      <w:r>
+        <w:t xml:space="preserve">- </w:t>
+      </w:r>
+      <w:r>
+        <w:rPr>
+          <w:b/>
+        </w:rPr>
+        <w:t>Phase 4 (Error/Logging)</w:t>
+      </w:r>
+      <w:r>
+        <w:t>: 0 completed, 2 partially completed, 2 pending</w:t>
+      </w:r>
+    </w:p>
+    <w:p>
+      <w:r>
+        <w:t xml:space="preserve">- </w:t>
+      </w:r>
+      <w:r>
+        <w:rPr>
+          <w:b/>
+        </w:rPr>
+        <w:t>Phase 5 (Documentation)</w:t>
+      </w:r>
+      <w:r>
+        <w:t>: 0 completed, 0 partially completed, 2 pending</w:t>
+      </w:r>
+    </w:p>
+    <w:p>
+      <w:r>
+        <w:t xml:space="preserve">- </w:t>
+      </w:r>
+      <w:r>
+        <w:rPr>
+          <w:b/>
+        </w:rPr>
+        <w:t>Phase 6 (Testing)</w:t>
+      </w:r>
+      <w:r>
+        <w:t>: 0 completed, 0 partially completed, 4 pending</w:t>
+      </w:r>
+    </w:p>
+    <w:p>
+      <w:r>
+        <w:t xml:space="preserve">- </w:t>
+      </w:r>
+      <w:r>
+        <w:rPr>
+          <w:b/>
+        </w:rPr>
+        <w:t>Phase 7 (Deployment)</w:t>
+      </w:r>
+      <w:r>
+        <w:t>: 0 completed, 0 partially completed, 3 pending</w:t>
+      </w:r>
+    </w:p>
+    <w:p>
+      <w:r>
+        <w:t xml:space="preserve">- </w:t>
+      </w:r>
+      <w:r>
+        <w:rPr>
+          <w:b/>
+        </w:rPr>
+        <w:t>Phase 8 (Evaluation)</w:t>
+      </w:r>
+      <w:r>
+        <w:t>: 0 completed, 0 partially completed, 3 pending</w:t>
+      </w:r>
+    </w:p>
+    <w:p/>
+    <w:p>
+      <w:pPr>
+        <w:pStyle w:val="Heading3"/>
+      </w:pPr>
+      <w:r>
+        <w:t>Next Steps</w:t>
+      </w:r>
+    </w:p>
+    <w:p/>
+    <w:p>
+      <w:r>
+        <w:t xml:space="preserve">1. </w:t>
+      </w:r>
+      <w:r>
+        <w:rPr>
+          <w:b/>
+        </w:rPr>
+        <w:t>Consolidation Phase</w:t>
+      </w:r>
+      <w:r>
+        <w:t>: Move existing R&amp;D code into AISA_Bot structure</w:t>
+      </w:r>
+    </w:p>
+    <w:p>
+      <w:pPr>
+        <w:pStyle w:val="ListBullet"/>
+      </w:pPr>
+      <w:r>
+        <w:t>Create src/github_fetcher.py from scripts/fetch-issue-comments.py + org_fetcher.py + repo_fetcher.py</w:t>
+      </w:r>
+    </w:p>
+    <w:p>
+      <w:pPr>
+        <w:pStyle w:val="ListBullet"/>
+      </w:pPr>
+      <w:r>
+        <w:t>Create src/label_applier.py from API_repo_labels/scripts/repo_labeler.py</w:t>
+      </w:r>
+    </w:p>
+    <w:p>
+      <w:pPr>
+        <w:pStyle w:val="ListBullet"/>
+      </w:pPr>
+      <w:r>
+        <w:t>Create src/prompt_builder.py incorporating API_repo_labels/scripts/excel_to_json.py</w:t>
+      </w:r>
+    </w:p>
+    <w:p>
+      <w:pPr>
+        <w:pStyle w:val="ListBullet"/>
+      </w:pPr>
+      <w:r>
+        <w:t>Create src/utils.py from common utility functions</w:t>
+      </w:r>
+    </w:p>
+    <w:p/>
+    <w:p>
+      <w:r>
+        <w:t xml:space="preserve">2. </w:t>
+      </w:r>
+      <w:r>
+        <w:rPr>
+          <w:b/>
+        </w:rPr>
+        <w:t>New Development</w:t>
+      </w:r>
+      <w:r>
+        <w:t>: Implement missing components</w:t>
+      </w:r>
+    </w:p>
+    <w:p>
+      <w:pPr>
+        <w:pStyle w:val="ListBullet"/>
+      </w:pPr>
+      <w:r>
+        <w:t>OpenAI client (Task 14)</w:t>
+      </w:r>
+    </w:p>
+    <w:p>
+      <w:pPr>
+        <w:pStyle w:val="ListBullet"/>
+      </w:pPr>
+      <w:r>
+        <w:t>Comment poster (Task 20)</w:t>
+      </w:r>
+    </w:p>
+    <w:p>
+      <w:pPr>
+        <w:pStyle w:val="ListBullet"/>
+      </w:pPr>
+      <w:r>
+        <w:t>Pipeline orchestration (Task 26)</w:t>
+      </w:r>
+    </w:p>
+    <w:p>
+      <w:pPr>
+        <w:pStyle w:val="ListBullet"/>
+      </w:pPr>
+      <w:r>
+        <w:t>CLI entry point (Task 28)</w:t>
+      </w:r>
+    </w:p>
+    <w:p/>
+    <w:p>
+      <w:r>
+        <w:t>________________________________________________________________________________</w:t>
+      </w:r>
+    </w:p>
+    <w:p/>
+    <w:p>
+      <w:pPr>
+        <w:pStyle w:val="Heading2"/>
+      </w:pPr>
+      <w:r>
+        <w:t>👥 Contributors</w:t>
+      </w:r>
+    </w:p>
+    <w:p/>
+    <w:p>
+      <w:pPr>
+        <w:pStyle w:val="Heading3"/>
+      </w:pPr>
+      <w:r>
+        <w:t>Code Contributors</w:t>
+      </w:r>
+    </w:p>
+    <w:p>
+      <w:r>
+        <w:t xml:space="preserve">- </w:t>
+      </w:r>
+      <w:r>
+        <w:rPr>
+          <w:b/>
+        </w:rPr>
+        <w:t>JasonUranta</w:t>
+      </w:r>
+      <w:r>
+        <w:t>: scripts/fetch-issue-comments.py, .github workflows, .gitignore, data management utilities</w:t>
+      </w:r>
+    </w:p>
+    <w:p>
+      <w:r>
+        <w:t xml:space="preserve">- </w:t>
+      </w:r>
+      <w:r>
+        <w:rPr>
+          <w:b/>
+        </w:rPr>
+        <w:t>Sandy3w</w:t>
+      </w:r>
+      <w:r>
+        <w:t>: issue_contributor_fetcher (org_fetcher.py, repo_fetcher.py), pending prompt implementation</w:t>
+      </w:r>
+    </w:p>
+    <w:p>
+      <w:r>
+        <w:t xml:space="preserve">- </w:t>
+      </w:r>
+      <w:r>
+        <w:rPr>
+          <w:b/>
+        </w:rPr>
+        <w:t>chinaexpert1</w:t>
+      </w:r>
+      <w:r>
+        <w:t>: requirements.txt, LLM prompt research (Task 12)</w:t>
+      </w:r>
+    </w:p>
+    <w:p>
+      <w:r>
+        <w:t xml:space="preserve">- </w:t>
+      </w:r>
+      <w:r>
+        <w:rPr>
+          <w:b/>
+        </w:rPr>
+        <w:t>ExperimentsInHonesty</w:t>
+      </w:r>
+      <w:r>
+        <w:t>: requirements.txt</w:t>
+      </w:r>
+    </w:p>
+    <w:p>
+      <w:r>
+        <w:t xml:space="preserve">- </w:t>
+      </w:r>
+      <w:r>
+        <w:rPr>
+          <w:b/>
+        </w:rPr>
+        <w:t>Claude Code</w:t>
+      </w:r>
+      <w:r>
+        <w:t>: Project structure setup (AISA_Bot directory)</w:t>
+      </w:r>
+    </w:p>
+    <w:p/>
+    <w:p>
+      <w:pPr>
+        <w:pStyle w:val="Heading3"/>
+      </w:pPr>
+      <w:r>
+        <w:t>Research &amp; Documentation</w:t>
+      </w:r>
+    </w:p>
+    <w:p>
+      <w:r>
+        <w:t xml:space="preserve">- </w:t>
+      </w:r>
+      <w:r>
+        <w:rPr>
+          <w:b/>
+        </w:rPr>
+        <w:t>chinaexpert1</w:t>
+      </w:r>
+      <w:r>
+        <w:t>: LLM prompt design research (awaiting implementation from Sandy3w)</w:t>
+      </w:r>
+    </w:p>
+    <w:p/>
+    <w:p>
+      <w:pPr>
+        <w:pStyle w:val="Heading3"/>
+      </w:pPr>
+      <w:r>
+        <w:t>Pending Work Assignments</w:t>
+      </w:r>
+    </w:p>
+    <w:p>
+      <w:r>
+        <w:t xml:space="preserve">- </w:t>
+      </w:r>
+      <w:r>
+        <w:rPr>
+          <w:b/>
+        </w:rPr>
+        <w:t>Sandy3w</w:t>
+      </w:r>
+      <w:r>
+        <w:t>: Task 12 implementation (LLM prompt format)</w:t>
       </w:r>
     </w:p>
     <w:p/>

</xml_diff>